<commit_message>
feat(manuscript): integrate 6 publication-grade figures into Markdown, Word docx, and compiled XeLaTeX PDF
</commit_message>
<xml_diff>
--- a/manuscript/论文_潜伏控制相变与遥测退化约束下的风电运行备用决策_最小充分模型准则.docx
+++ b/manuscript/论文_潜伏控制相变与遥测退化约束下的风电运行备用决策_最小充分模型准则.docx
@@ -2558,6 +2558,93 @@
     </w:p>
     <w:p>
       <w:pPr>
+        <w:spacing w:before="0" w:after="60" w:line="300" w:lineRule="auto"/>
+        <w:ind w:firstLine="480"/>
+        <w:jc w:val="both"/>
+      </w:pPr>
+      <w:r>
+        <w:rPr>
+          <w:rFonts w:ascii="Times New Roman" w:hAnsi="Times New Roman"/>
+          <w:b w:val="0"/>
+          <w:i w:val="0"/>
+          <w:color w:val="000000"/>
+          <w:sz w:val="24"/>
+          <w:rFonts w:ascii="Times New Roman" w:hAnsi="Times New Roman" w:eastAsia="宋体" w:cs="Times New Roman"/>
+        </w:rPr>
+        <w:t>面向工业 SCADA 遥测退化的全流程决策与两阶段正交优化解耦机制如图 1 所示。从图 1 可以看出，该架构包含自上而下的量测接入、退化阶梯门控判别、第一阶段基于均方误差损失的出力期望特征拟合与参数冻结，以及第二阶段基于轻量残差网络的非对称分位数校准，从结构上切断了极端报童惩罚向底层主干网络的梯度回传。</w:t>
+      </w:r>
+    </w:p>
+    <w:p>
+      <w:pPr>
+        <w:keepNext/>
+        <w:spacing w:before="160" w:after="40"/>
+        <w:jc w:val="center"/>
+      </w:pPr>
+      <w:r>
+        <w:drawing>
+          <wp:inline xmlns:a="http://schemas.openxmlformats.org/drawingml/2006/main" xmlns:pic="http://schemas.openxmlformats.org/drawingml/2006/picture">
+            <wp:extent cx="5303520" cy="4697403"/>
+            <wp:docPr id="1" name="Picture 1"/>
+            <wp:cNvGraphicFramePr>
+              <a:graphicFrameLocks noChangeAspect="1"/>
+            </wp:cNvGraphicFramePr>
+            <a:graphic>
+              <a:graphicData uri="http://schemas.openxmlformats.org/drawingml/2006/picture">
+                <pic:pic>
+                  <pic:nvPicPr>
+                    <pic:cNvPr id="0" name="figure1_decision_boundaries.png"/>
+                    <pic:cNvPicPr/>
+                  </pic:nvPicPr>
+                  <pic:blipFill>
+                    <a:blip r:embed="rId9"/>
+                    <a:stretch>
+                      <a:fillRect/>
+                    </a:stretch>
+                  </pic:blipFill>
+                  <pic:spPr>
+                    <a:xfrm>
+                      <a:off x="0" y="0"/>
+                      <a:ext cx="5303520" cy="4697403"/>
+                    </a:xfrm>
+                    <a:prstGeom prst="rect"/>
+                  </pic:spPr>
+                </pic:pic>
+              </a:graphicData>
+            </a:graphic>
+          </wp:inline>
+        </w:drawing>
+      </w:r>
+    </w:p>
+    <w:p>
+      <w:pPr>
+        <w:spacing w:before="40" w:after="160" w:line="288" w:lineRule="auto"/>
+        <w:jc w:val="center"/>
+      </w:pPr>
+      <w:r>
+        <w:rPr>
+          <w:rFonts w:ascii="Times New Roman" w:hAnsi="Times New Roman"/>
+          <w:b/>
+          <w:i w:val="0"/>
+          <w:color w:val="000000"/>
+          <w:sz w:val="21"/>
+          <w:rFonts w:ascii="Times New Roman" w:hAnsi="Times New Roman" w:eastAsia="黑体" w:cs="Times New Roman"/>
+        </w:rPr>
+        <w:t>图 1</w:t>
+      </w:r>
+      <w:r>
+        <w:rPr>
+          <w:rFonts w:ascii="Times New Roman" w:hAnsi="Times New Roman"/>
+          <w:b/>
+          <w:i w:val="0"/>
+          <w:color w:val="000000"/>
+          <w:sz w:val="21"/>
+          <w:rFonts w:ascii="Times New Roman" w:hAnsi="Times New Roman" w:eastAsia="黑体" w:cs="Times New Roman"/>
+        </w:rPr>
+        <w:t xml:space="preserve"> 遥测退化阶梯与正交两阶段风电备用决策机制架构</w:t>
+      </w:r>
+    </w:p>
+    <w:p>
+      <w:pPr>
         <w:keepNext/>
         <w:spacing w:before="280" w:after="120" w:line="300" w:lineRule="auto"/>
         <w:jc w:val="left"/>
@@ -2820,6 +2907,93 @@
           <w:rFonts w:ascii="Times New Roman" w:hAnsi="Times New Roman" w:eastAsia="宋体" w:cs="Times New Roman"/>
         </w:rPr>
         <w:t>。</w:t>
+      </w:r>
+    </w:p>
+    <w:p>
+      <w:pPr>
+        <w:spacing w:before="0" w:after="60" w:line="300" w:lineRule="auto"/>
+        <w:ind w:firstLine="480"/>
+        <w:jc w:val="both"/>
+      </w:pPr>
+      <w:r>
+        <w:rPr>
+          <w:rFonts w:ascii="Times New Roman" w:hAnsi="Times New Roman"/>
+          <w:b w:val="0"/>
+          <w:i w:val="0"/>
+          <w:color w:val="000000"/>
+          <w:sz w:val="24"/>
+          <w:rFonts w:ascii="Times New Roman" w:hAnsi="Times New Roman" w:eastAsia="宋体" w:cs="Times New Roman"/>
+        </w:rPr>
+        <w:t>SDWPF 源风电场的 134 台机组空间拓扑阵列与典型风速-功率动力学相变特性如图 2 所示。图 2(a) 清晰呈现了风电集群呈多列密集排布的空间拓扑阵列；图 2(b) 揭示了机组在额定风速前后的非线性气动分段特性：在额定风速以下功率随风速呈三次上升（MPPT 区），当风速突破额定拐点后，受叶片变桨限功率控制，出力被强制约束在额定平顶附近，这一动力学相变是风电机组在调度端表现出非对称残差特征的物理本质。</w:t>
+      </w:r>
+    </w:p>
+    <w:p>
+      <w:pPr>
+        <w:keepNext/>
+        <w:spacing w:before="160" w:after="40"/>
+        <w:jc w:val="center"/>
+      </w:pPr>
+      <w:r>
+        <w:drawing>
+          <wp:inline xmlns:a="http://schemas.openxmlformats.org/drawingml/2006/main" xmlns:pic="http://schemas.openxmlformats.org/drawingml/2006/picture">
+            <wp:extent cx="5303520" cy="4080774"/>
+            <wp:docPr id="2" name="Picture 2"/>
+            <wp:cNvGraphicFramePr>
+              <a:graphicFrameLocks noChangeAspect="1"/>
+            </wp:cNvGraphicFramePr>
+            <a:graphic>
+              <a:graphicData uri="http://schemas.openxmlformats.org/drawingml/2006/picture">
+                <pic:pic>
+                  <pic:nvPicPr>
+                    <pic:cNvPr id="0" name="figure2_data_boundary.png"/>
+                    <pic:cNvPicPr/>
+                  </pic:nvPicPr>
+                  <pic:blipFill>
+                    <a:blip r:embed="rId10"/>
+                    <a:stretch>
+                      <a:fillRect/>
+                    </a:stretch>
+                  </pic:blipFill>
+                  <pic:spPr>
+                    <a:xfrm>
+                      <a:off x="0" y="0"/>
+                      <a:ext cx="5303520" cy="4080774"/>
+                    </a:xfrm>
+                    <a:prstGeom prst="rect"/>
+                  </pic:spPr>
+                </pic:pic>
+              </a:graphicData>
+            </a:graphic>
+          </wp:inline>
+        </w:drawing>
+      </w:r>
+    </w:p>
+    <w:p>
+      <w:pPr>
+        <w:spacing w:before="40" w:after="160" w:line="288" w:lineRule="auto"/>
+        <w:jc w:val="center"/>
+      </w:pPr>
+      <w:r>
+        <w:rPr>
+          <w:rFonts w:ascii="Times New Roman" w:hAnsi="Times New Roman"/>
+          <w:b/>
+          <w:i w:val="0"/>
+          <w:color w:val="000000"/>
+          <w:sz w:val="21"/>
+          <w:rFonts w:ascii="Times New Roman" w:hAnsi="Times New Roman" w:eastAsia="黑体" w:cs="Times New Roman"/>
+        </w:rPr>
+        <w:t>图 2</w:t>
+      </w:r>
+      <w:r>
+        <w:rPr>
+          <w:rFonts w:ascii="Times New Roman" w:hAnsi="Times New Roman"/>
+          <w:b/>
+          <w:i w:val="0"/>
+          <w:color w:val="000000"/>
+          <w:sz w:val="21"/>
+          <w:rFonts w:ascii="Times New Roman" w:hAnsi="Times New Roman" w:eastAsia="黑体" w:cs="Times New Roman"/>
+        </w:rPr>
+        <w:t xml:space="preserve"> SDWPF 134 台风电机组空间拓扑阵列与典型机电相变分段特性</w:t>
       </w:r>
     </w:p>
     <w:p>
@@ -6031,6 +6205,93 @@
     </w:p>
     <w:p>
       <w:pPr>
+        <w:spacing w:before="0" w:after="60" w:line="300" w:lineRule="auto"/>
+        <w:ind w:firstLine="480"/>
+        <w:jc w:val="both"/>
+      </w:pPr>
+      <w:r>
+        <w:rPr>
+          <w:rFonts w:ascii="Times New Roman" w:hAnsi="Times New Roman"/>
+          <w:b w:val="0"/>
+          <w:i w:val="0"/>
+          <w:color w:val="000000"/>
+          <w:sz w:val="24"/>
+          <w:rFonts w:ascii="Times New Roman" w:hAnsi="Times New Roman" w:eastAsia="宋体" w:cs="Times New Roman"/>
+        </w:rPr>
+        <w:t>不同遥测退化约束下各基准模型的全周期预测精度与综合考核成本全景对比如图 3 所示。从图 3 可以直观看出：在完好遥测工况下，连续气动物理模型保持全场最低成本；而端到端直接分位数网络在极端非对称损失拉扯下盲目超额采购备用，导致考核成本严重反冲；本文提出的 STGQ 两阶段正交解耦模型有效阻断了梯度畸变，在变桨屏蔽与时延工况下展现出卓越的成本抑制与风险均衡能力。</w:t>
+      </w:r>
+    </w:p>
+    <w:p>
+      <w:pPr>
+        <w:keepNext/>
+        <w:spacing w:before="160" w:after="40"/>
+        <w:jc w:val="center"/>
+      </w:pPr>
+      <w:r>
+        <w:drawing>
+          <wp:inline xmlns:a="http://schemas.openxmlformats.org/drawingml/2006/main" xmlns:pic="http://schemas.openxmlformats.org/drawingml/2006/picture">
+            <wp:extent cx="5303520" cy="3836868"/>
+            <wp:docPr id="3" name="Picture 3"/>
+            <wp:cNvGraphicFramePr>
+              <a:graphicFrameLocks noChangeAspect="1"/>
+            </wp:cNvGraphicFramePr>
+            <a:graphic>
+              <a:graphicData uri="http://schemas.openxmlformats.org/drawingml/2006/picture">
+                <pic:pic>
+                  <pic:nvPicPr>
+                    <pic:cNvPr id="0" name="figure3_summary_results.png"/>
+                    <pic:cNvPicPr/>
+                  </pic:nvPicPr>
+                  <pic:blipFill>
+                    <a:blip r:embed="rId11"/>
+                    <a:stretch>
+                      <a:fillRect/>
+                    </a:stretch>
+                  </pic:blipFill>
+                  <pic:spPr>
+                    <a:xfrm>
+                      <a:off x="0" y="0"/>
+                      <a:ext cx="5303520" cy="3836868"/>
+                    </a:xfrm>
+                    <a:prstGeom prst="rect"/>
+                  </pic:spPr>
+                </pic:pic>
+              </a:graphicData>
+            </a:graphic>
+          </wp:inline>
+        </w:drawing>
+      </w:r>
+    </w:p>
+    <w:p>
+      <w:pPr>
+        <w:spacing w:before="40" w:after="160" w:line="288" w:lineRule="auto"/>
+        <w:jc w:val="center"/>
+      </w:pPr>
+      <w:r>
+        <w:rPr>
+          <w:rFonts w:ascii="Times New Roman" w:hAnsi="Times New Roman"/>
+          <w:b/>
+          <w:i w:val="0"/>
+          <w:color w:val="000000"/>
+          <w:sz w:val="21"/>
+          <w:rFonts w:ascii="Times New Roman" w:hAnsi="Times New Roman" w:eastAsia="黑体" w:cs="Times New Roman"/>
+        </w:rPr>
+        <w:t>图 3</w:t>
+      </w:r>
+      <w:r>
+        <w:rPr>
+          <w:rFonts w:ascii="Times New Roman" w:hAnsi="Times New Roman"/>
+          <w:b/>
+          <w:i w:val="0"/>
+          <w:color w:val="000000"/>
+          <w:sz w:val="21"/>
+          <w:rFonts w:ascii="Times New Roman" w:hAnsi="Times New Roman" w:eastAsia="黑体" w:cs="Times New Roman"/>
+        </w:rPr>
+        <w:t xml:space="preserve"> 遥测退化约束下各基准模型预测精度与综合考核成本全景对比</w:t>
+      </w:r>
+    </w:p>
+    <w:p>
+      <w:pPr>
         <w:keepNext/>
         <w:spacing w:before="200" w:after="80" w:line="300" w:lineRule="auto"/>
         <w:jc w:val="left"/>
@@ -7920,6 +8181,93 @@
     </w:p>
     <w:p>
       <w:pPr>
+        <w:spacing w:before="0" w:after="60" w:line="300" w:lineRule="auto"/>
+        <w:ind w:firstLine="480"/>
+        <w:jc w:val="both"/>
+      </w:pPr>
+      <w:r>
+        <w:rPr>
+          <w:rFonts w:ascii="Times New Roman" w:hAnsi="Times New Roman"/>
+          <w:b w:val="0"/>
+          <w:i w:val="0"/>
+          <w:color w:val="000000"/>
+          <w:sz w:val="24"/>
+          <w:rFonts w:ascii="Times New Roman" w:hAnsi="Times New Roman" w:eastAsia="宋体" w:cs="Times New Roman"/>
+        </w:rPr>
+        <w:t>为了深入观察机组出力在控制相变时的微观动态响应，图 5 展示了一段跨越平稳区、强阵风突变与变桨相变过程的典型机组出力与备用决策时序对比。如图 5 所示，当机组遭遇强风并触发变桨动作时，由于调度端缺失变桨遥测，传统气动物理模型发生严重的出力高估，导致备用裕度严重不足并引发巨额短缺惩罚；端到端深度学习模型则表现出极度的盲目保守，全时段分配海量冗余备用；相比之下，本文提出的两阶段正交解耦模型能够精准捕获机电动态响应并及时调整备用边界，兼顾了系统安全与经济性。</w:t>
+      </w:r>
+    </w:p>
+    <w:p>
+      <w:pPr>
+        <w:keepNext/>
+        <w:spacing w:before="160" w:after="40"/>
+        <w:jc w:val="center"/>
+      </w:pPr>
+      <w:r>
+        <w:drawing>
+          <wp:inline xmlns:a="http://schemas.openxmlformats.org/drawingml/2006/main" xmlns:pic="http://schemas.openxmlformats.org/drawingml/2006/picture">
+            <wp:extent cx="5303520" cy="3439032"/>
+            <wp:docPr id="4" name="Picture 4"/>
+            <wp:cNvGraphicFramePr>
+              <a:graphicFrameLocks noChangeAspect="1"/>
+            </wp:cNvGraphicFramePr>
+            <a:graphic>
+              <a:graphicData uri="http://schemas.openxmlformats.org/drawingml/2006/picture">
+                <pic:pic>
+                  <pic:nvPicPr>
+                    <pic:cNvPr id="0" name="figure5_case_studies.png"/>
+                    <pic:cNvPicPr/>
+                  </pic:nvPicPr>
+                  <pic:blipFill>
+                    <a:blip r:embed="rId12"/>
+                    <a:stretch>
+                      <a:fillRect/>
+                    </a:stretch>
+                  </pic:blipFill>
+                  <pic:spPr>
+                    <a:xfrm>
+                      <a:off x="0" y="0"/>
+                      <a:ext cx="5303520" cy="3439032"/>
+                    </a:xfrm>
+                    <a:prstGeom prst="rect"/>
+                  </pic:spPr>
+                </pic:pic>
+              </a:graphicData>
+            </a:graphic>
+          </wp:inline>
+        </w:drawing>
+      </w:r>
+    </w:p>
+    <w:p>
+      <w:pPr>
+        <w:spacing w:before="40" w:after="160" w:line="288" w:lineRule="auto"/>
+        <w:jc w:val="center"/>
+      </w:pPr>
+      <w:r>
+        <w:rPr>
+          <w:rFonts w:ascii="Times New Roman" w:hAnsi="Times New Roman"/>
+          <w:b/>
+          <w:i w:val="0"/>
+          <w:color w:val="000000"/>
+          <w:sz w:val="21"/>
+          <w:rFonts w:ascii="Times New Roman" w:hAnsi="Times New Roman" w:eastAsia="黑体" w:cs="Times New Roman"/>
+        </w:rPr>
+        <w:t>图 5</w:t>
+      </w:r>
+      <w:r>
+        <w:rPr>
+          <w:rFonts w:ascii="Times New Roman" w:hAnsi="Times New Roman"/>
+          <w:b/>
+          <w:i w:val="0"/>
+          <w:color w:val="000000"/>
+          <w:sz w:val="21"/>
+          <w:rFonts w:ascii="Times New Roman" w:hAnsi="Times New Roman" w:eastAsia="黑体" w:cs="Times New Roman"/>
+        </w:rPr>
+        <w:t xml:space="preserve"> 典型控制相变窗口下机组实际出力与不同决策模型备用配置时序响应对比</w:t>
+      </w:r>
+    </w:p>
+    <w:p>
+      <w:pPr>
         <w:keepNext/>
         <w:spacing w:before="200" w:after="80" w:line="288" w:lineRule="auto"/>
         <w:jc w:val="center"/>
@@ -9048,6 +9396,93 @@
           <w:sz w:val="24"/>
           <w:rFonts w:ascii="Times New Roman" w:hAnsi="Times New Roman" w:eastAsia="宋体" w:cs="Times New Roman"/>
         </w:rPr>
+        <w:t>相变过渡期等备用预算约束下的短缺电量消融前沿面与 5 个随机种子的差值分布如图 6 所示。图 6 清楚地证实：在剥离超额采购的资金优势后，深度后验模型的有效风险对冲边界并未优于简单的风速经验分位数模型，其在 5 个随机种子中的 4 个均落入短缺电量增加的劣化区域，直观印证了表 4 揭示的容量冗余本质。</w:t>
+      </w:r>
+    </w:p>
+    <w:p>
+      <w:pPr>
+        <w:keepNext/>
+        <w:spacing w:before="160" w:after="40"/>
+        <w:jc w:val="center"/>
+      </w:pPr>
+      <w:r>
+        <w:drawing>
+          <wp:inline xmlns:a="http://schemas.openxmlformats.org/drawingml/2006/main" xmlns:pic="http://schemas.openxmlformats.org/drawingml/2006/picture">
+            <wp:extent cx="5303520" cy="1515291"/>
+            <wp:docPr id="5" name="Picture 5"/>
+            <wp:cNvGraphicFramePr>
+              <a:graphicFrameLocks noChangeAspect="1"/>
+            </wp:cNvGraphicFramePr>
+            <a:graphic>
+              <a:graphicData uri="http://schemas.openxmlformats.org/drawingml/2006/picture">
+                <pic:pic>
+                  <pic:nvPicPr>
+                    <pic:cNvPr id="0" name="matched_budget_transition_frontier.png"/>
+                    <pic:cNvPicPr/>
+                  </pic:nvPicPr>
+                  <pic:blipFill>
+                    <a:blip r:embed="rId13"/>
+                    <a:stretch>
+                      <a:fillRect/>
+                    </a:stretch>
+                  </pic:blipFill>
+                  <pic:spPr>
+                    <a:xfrm>
+                      <a:off x="0" y="0"/>
+                      <a:ext cx="5303520" cy="1515291"/>
+                    </a:xfrm>
+                    <a:prstGeom prst="rect"/>
+                  </pic:spPr>
+                </pic:pic>
+              </a:graphicData>
+            </a:graphic>
+          </wp:inline>
+        </w:drawing>
+      </w:r>
+    </w:p>
+    <w:p>
+      <w:pPr>
+        <w:spacing w:before="40" w:after="160" w:line="288" w:lineRule="auto"/>
+        <w:jc w:val="center"/>
+      </w:pPr>
+      <w:r>
+        <w:rPr>
+          <w:rFonts w:ascii="Times New Roman" w:hAnsi="Times New Roman"/>
+          <w:b/>
+          <w:i w:val="0"/>
+          <w:color w:val="000000"/>
+          <w:sz w:val="21"/>
+          <w:rFonts w:ascii="Times New Roman" w:hAnsi="Times New Roman" w:eastAsia="黑体" w:cs="Times New Roman"/>
+        </w:rPr>
+        <w:t>图 6</w:t>
+      </w:r>
+      <w:r>
+        <w:rPr>
+          <w:rFonts w:ascii="Times New Roman" w:hAnsi="Times New Roman"/>
+          <w:b/>
+          <w:i w:val="0"/>
+          <w:color w:val="000000"/>
+          <w:sz w:val="21"/>
+          <w:rFonts w:ascii="Times New Roman" w:hAnsi="Times New Roman" w:eastAsia="黑体" w:cs="Times New Roman"/>
+        </w:rPr>
+        <w:t xml:space="preserve"> 相变过渡期等备用预算约束下短缺电量消融前沿面与权衡分析</w:t>
+      </w:r>
+    </w:p>
+    <w:p>
+      <w:pPr>
+        <w:spacing w:before="0" w:after="60" w:line="300" w:lineRule="auto"/>
+        <w:ind w:firstLine="480"/>
+        <w:jc w:val="both"/>
+      </w:pPr>
+      <w:r>
+        <w:rPr>
+          <w:rFonts w:ascii="Times New Roman" w:hAnsi="Times New Roman"/>
+          <w:b w:val="0"/>
+          <w:i w:val="0"/>
+          <w:color w:val="000000"/>
+          <w:sz w:val="24"/>
+          <w:rFonts w:ascii="Times New Roman" w:hAnsi="Times New Roman" w:eastAsia="宋体" w:cs="Times New Roman"/>
+        </w:rPr>
         <w:t>最后，在架构复杂度检验中，参数量对齐为 110,012 的 STGQ-Dense 与 STGQ-Routed 成本差值仅为 +32,154 kWh（95% 置信区间 [-1,100, +65,500]，</w:t>
       </w:r>
       <w:r>
@@ -9115,6 +9550,93 @@
           <w:rFonts w:ascii="Times New Roman" w:hAnsi="Times New Roman" w:eastAsia="宋体" w:cs="Times New Roman"/>
         </w:rPr>
         <w:t>），实证表明脱离本地标定的黑盒模型在跨场站迁移时面临显著的经济失配风险。</w:t>
+      </w:r>
+    </w:p>
+    <w:p>
+      <w:pPr>
+        <w:spacing w:before="0" w:after="60" w:line="300" w:lineRule="auto"/>
+        <w:ind w:firstLine="480"/>
+        <w:jc w:val="both"/>
+      </w:pPr>
+      <w:r>
+        <w:rPr>
+          <w:rFonts w:ascii="Times New Roman" w:hAnsi="Times New Roman"/>
+          <w:b w:val="0"/>
+          <w:i w:val="0"/>
+          <w:color w:val="000000"/>
+          <w:sz w:val="24"/>
+          <w:rFonts w:ascii="Times New Roman" w:hAnsi="Times New Roman" w:eastAsia="宋体" w:cs="Times New Roman"/>
+        </w:rPr>
+        <w:t>混合专家门控路由的分段转移行为与机组间空间互信息分布如图 4 所示。由图 4(a) 可见，门控分配权重随着进风风速平滑演变，在额定风速临界点前后表现为渐进过渡而非离散阶跃；图 4(b) 表明，空间图卷积所提取的相邻机组间尾流互信息增益仅为 0.0015，在统计上属于微弱扰动。这一实证证据有力解释了为何复杂的动态路由与空间图拓扑未能带来显著的决策提升，证实了密集解耦架构在工业应用中的充分性。</w:t>
+      </w:r>
+    </w:p>
+    <w:p>
+      <w:pPr>
+        <w:keepNext/>
+        <w:spacing w:before="160" w:after="40"/>
+        <w:jc w:val="center"/>
+      </w:pPr>
+      <w:r>
+        <w:drawing>
+          <wp:inline xmlns:a="http://schemas.openxmlformats.org/drawingml/2006/main" xmlns:pic="http://schemas.openxmlformats.org/drawingml/2006/picture">
+            <wp:extent cx="5303520" cy="4040950"/>
+            <wp:docPr id="6" name="Picture 6"/>
+            <wp:cNvGraphicFramePr>
+              <a:graphicFrameLocks noChangeAspect="1"/>
+            </wp:cNvGraphicFramePr>
+            <a:graphic>
+              <a:graphicData uri="http://schemas.openxmlformats.org/drawingml/2006/picture">
+                <pic:pic>
+                  <pic:nvPicPr>
+                    <pic:cNvPr id="0" name="figure4_routing_evidence.png"/>
+                    <pic:cNvPicPr/>
+                  </pic:nvPicPr>
+                  <pic:blipFill>
+                    <a:blip r:embed="rId14"/>
+                    <a:stretch>
+                      <a:fillRect/>
+                    </a:stretch>
+                  </pic:blipFill>
+                  <pic:spPr>
+                    <a:xfrm>
+                      <a:off x="0" y="0"/>
+                      <a:ext cx="5303520" cy="4040950"/>
+                    </a:xfrm>
+                    <a:prstGeom prst="rect"/>
+                  </pic:spPr>
+                </pic:pic>
+              </a:graphicData>
+            </a:graphic>
+          </wp:inline>
+        </w:drawing>
+      </w:r>
+    </w:p>
+    <w:p>
+      <w:pPr>
+        <w:spacing w:before="40" w:after="160" w:line="288" w:lineRule="auto"/>
+        <w:jc w:val="center"/>
+      </w:pPr>
+      <w:r>
+        <w:rPr>
+          <w:rFonts w:ascii="Times New Roman" w:hAnsi="Times New Roman"/>
+          <w:b/>
+          <w:i w:val="0"/>
+          <w:color w:val="000000"/>
+          <w:sz w:val="21"/>
+          <w:rFonts w:ascii="Times New Roman" w:hAnsi="Times New Roman" w:eastAsia="黑体" w:cs="Times New Roman"/>
+        </w:rPr>
+        <w:t>图 4</w:t>
+      </w:r>
+      <w:r>
+        <w:rPr>
+          <w:rFonts w:ascii="Times New Roman" w:hAnsi="Times New Roman"/>
+          <w:b/>
+          <w:i w:val="0"/>
+          <w:color w:val="000000"/>
+          <w:sz w:val="21"/>
+          <w:rFonts w:ascii="Times New Roman" w:hAnsi="Times New Roman" w:eastAsia="黑体" w:cs="Times New Roman"/>
+        </w:rPr>
+        <w:t xml:space="preserve"> 基于风速区间的门控路由转移概率与机组间空间互信息证据</w:t>
       </w:r>
     </w:p>
     <w:p>

</xml_diff>

<commit_message>
feat(submission): add bilingual metadata, highlights, and cover letter; update OMML Word docx and compiled PDF
</commit_message>
<xml_diff>
--- a/manuscript/论文_潜伏控制相变与遥测退化约束下的风电运行备用决策_最小充分模型准则.docx
+++ b/manuscript/论文_潜伏控制相变与遥测退化约束下的风电运行备用决策_最小充分模型准则.docx
@@ -21,9 +21,8 @@
     </w:p>
     <w:p>
       <w:pPr>
-        <w:spacing w:before="0" w:after="60" w:line="300" w:lineRule="auto"/>
-        <w:ind w:firstLine="480"/>
-        <w:jc w:val="both"/>
+        <w:spacing w:before="40" w:after="80" w:line="288" w:lineRule="auto"/>
+        <w:jc w:val="center"/>
       </w:pPr>
       <w:r>
         <w:rPr>
@@ -31,8 +30,8 @@
           <w:b/>
           <w:i w:val="0"/>
           <w:color w:val="000000"/>
-          <w:sz w:val="24"/>
-          <w:rFonts w:ascii="Times New Roman" w:hAnsi="Times New Roman" w:eastAsia="宋体" w:cs="Times New Roman"/>
+          <w:sz w:val="21"/>
+          <w:rFonts w:ascii="Times New Roman" w:hAnsi="Times New Roman" w:eastAsia="楷体" w:cs="Times New Roman"/>
         </w:rPr>
         <w:t>作者署名</w:t>
       </w:r>
@@ -42,8 +41,8 @@
           <w:b w:val="0"/>
           <w:i w:val="0"/>
           <w:color w:val="000000"/>
-          <w:sz w:val="24"/>
-          <w:rFonts w:ascii="Times New Roman" w:hAnsi="Times New Roman" w:eastAsia="宋体" w:cs="Times New Roman"/>
+          <w:sz w:val="21"/>
+          <w:rFonts w:ascii="Times New Roman" w:hAnsi="Times New Roman" w:eastAsia="楷体" w:cs="Times New Roman"/>
         </w:rPr>
         <w:t>：李俊宇，杜俊涛*</w:t>
       </w:r>
@@ -59,7 +58,7 @@
           <w:b/>
           <w:i w:val="0"/>
           <w:color w:val="000000"/>
-          <w:sz w:val="22"/>
+          <w:sz w:val="21"/>
           <w:rFonts w:ascii="Times New Roman" w:hAnsi="Times New Roman" w:eastAsia="楷体" w:cs="Times New Roman"/>
         </w:rPr>
         <w:t>作者单位</w:t>
@@ -70,7 +69,7 @@
           <w:b w:val="0"/>
           <w:i w:val="0"/>
           <w:color w:val="000000"/>
-          <w:sz w:val="22"/>
+          <w:sz w:val="21"/>
           <w:rFonts w:ascii="Times New Roman" w:hAnsi="Times New Roman" w:eastAsia="楷体" w:cs="Times New Roman"/>
         </w:rPr>
         <w:t>：安徽财经大学 统计与应用数学学院，蚌埠 233030，中国</w:t>
@@ -87,7 +86,7 @@
           <w:b/>
           <w:i w:val="0"/>
           <w:color w:val="000000"/>
-          <w:sz w:val="22"/>
+          <w:sz w:val="21"/>
           <w:rFonts w:ascii="Times New Roman" w:hAnsi="Times New Roman" w:eastAsia="楷体" w:cs="Times New Roman"/>
         </w:rPr>
         <w:t>通讯作者</w:t>
@@ -98,7 +97,7 @@
           <w:b w:val="0"/>
           <w:i w:val="0"/>
           <w:color w:val="000000"/>
-          <w:sz w:val="22"/>
+          <w:sz w:val="21"/>
           <w:rFonts w:ascii="Times New Roman" w:hAnsi="Times New Roman" w:eastAsia="楷体" w:cs="Times New Roman"/>
         </w:rPr>
         <w:t>：杜俊涛 (dujuntao@aufe.edu.cn)</w:t>
@@ -203,6 +202,208 @@
           <w:rFonts w:ascii="Times New Roman" w:hAnsi="Times New Roman" w:eastAsia="楷体" w:cs="Times New Roman"/>
         </w:rPr>
         <w:t>：风电备用容量；非对称考核；SCADA 遥测退化；变桨角缺失；两阶段决策；最小充分模型</w:t>
+      </w:r>
+    </w:p>
+    <w:p>
+      <w:pPr>
+        <w:spacing w:before="320" w:after="160" w:line="288" w:lineRule="auto"/>
+        <w:jc w:val="center"/>
+      </w:pPr>
+      <w:r>
+        <w:rPr>
+          <w:rFonts w:ascii="Times New Roman" w:hAnsi="Times New Roman"/>
+          <w:b/>
+          <w:i w:val="0"/>
+          <w:color w:val="000000"/>
+          <w:sz w:val="30"/>
+          <w:rFonts w:ascii="Times New Roman" w:hAnsi="Times New Roman" w:eastAsia="Times New Roman" w:cs="Times New Roman"/>
+        </w:rPr>
+        <w:t>Operating Reserve Decision-Making for Wind Power Under Latent Control Phase Transitions and Telemetry Degradation: A Minimal Sufficient Model Criterion</w:t>
+      </w:r>
+    </w:p>
+    <w:p>
+      <w:pPr>
+        <w:spacing w:before="40" w:after="80" w:line="288" w:lineRule="auto"/>
+        <w:jc w:val="center"/>
+      </w:pPr>
+      <w:r>
+        <w:rPr>
+          <w:rFonts w:ascii="Times New Roman" w:hAnsi="Times New Roman"/>
+          <w:b/>
+          <w:i w:val="0"/>
+          <w:color w:val="000000"/>
+          <w:sz w:val="21"/>
+          <w:rFonts w:ascii="Times New Roman" w:hAnsi="Times New Roman" w:eastAsia="楷体" w:cs="Times New Roman"/>
+        </w:rPr>
+        <w:t>Authors</w:t>
+      </w:r>
+      <w:r>
+        <w:rPr>
+          <w:rFonts w:ascii="Times New Roman" w:hAnsi="Times New Roman"/>
+          <w:b w:val="0"/>
+          <w:i w:val="0"/>
+          <w:color w:val="000000"/>
+          <w:sz w:val="21"/>
+          <w:rFonts w:ascii="Times New Roman" w:hAnsi="Times New Roman" w:eastAsia="楷体" w:cs="Times New Roman"/>
+        </w:rPr>
+        <w:t>: Junyu Li, Juntao Du*</w:t>
+      </w:r>
+    </w:p>
+    <w:p>
+      <w:pPr>
+        <w:spacing w:before="40" w:after="80" w:line="288" w:lineRule="auto"/>
+        <w:jc w:val="center"/>
+      </w:pPr>
+      <w:r>
+        <w:rPr>
+          <w:rFonts w:ascii="Times New Roman" w:hAnsi="Times New Roman"/>
+          <w:b/>
+          <w:i w:val="0"/>
+          <w:color w:val="000000"/>
+          <w:sz w:val="21"/>
+          <w:rFonts w:ascii="Times New Roman" w:hAnsi="Times New Roman" w:eastAsia="楷体" w:cs="Times New Roman"/>
+        </w:rPr>
+        <w:t>Affiliation</w:t>
+      </w:r>
+      <w:r>
+        <w:rPr>
+          <w:rFonts w:ascii="Times New Roman" w:hAnsi="Times New Roman"/>
+          <w:b w:val="0"/>
+          <w:i w:val="0"/>
+          <w:color w:val="000000"/>
+          <w:sz w:val="21"/>
+          <w:rFonts w:ascii="Times New Roman" w:hAnsi="Times New Roman" w:eastAsia="楷体" w:cs="Times New Roman"/>
+        </w:rPr>
+        <w:t>: School of Statistics and Applied Mathematics, Anhui University of Finance and Economics, Bengbu 233030, China</w:t>
+      </w:r>
+    </w:p>
+    <w:p>
+      <w:pPr>
+        <w:spacing w:before="40" w:after="80" w:line="288" w:lineRule="auto"/>
+        <w:jc w:val="center"/>
+      </w:pPr>
+      <w:r>
+        <w:rPr>
+          <w:rFonts w:ascii="Times New Roman" w:hAnsi="Times New Roman"/>
+          <w:b/>
+          <w:i w:val="0"/>
+          <w:color w:val="000000"/>
+          <w:sz w:val="21"/>
+          <w:rFonts w:ascii="Times New Roman" w:hAnsi="Times New Roman" w:eastAsia="楷体" w:cs="Times New Roman"/>
+        </w:rPr>
+        <w:t>Corresponding Author</w:t>
+      </w:r>
+      <w:r>
+        <w:rPr>
+          <w:rFonts w:ascii="Times New Roman" w:hAnsi="Times New Roman"/>
+          <w:b w:val="0"/>
+          <w:i w:val="0"/>
+          <w:color w:val="000000"/>
+          <w:sz w:val="21"/>
+          <w:rFonts w:ascii="Times New Roman" w:hAnsi="Times New Roman" w:eastAsia="楷体" w:cs="Times New Roman"/>
+        </w:rPr>
+        <w:t>: Juntao Du (dujuntao@aufe.edu.cn)</w:t>
+      </w:r>
+    </w:p>
+    <w:p>
+      <w:pPr>
+        <w:keepNext/>
+        <w:spacing w:before="200" w:after="80" w:line="300" w:lineRule="auto"/>
+        <w:jc w:val="center"/>
+      </w:pPr>
+      <w:r>
+        <w:rPr>
+          <w:rFonts w:ascii="Times New Roman" w:hAnsi="Times New Roman"/>
+          <w:b/>
+          <w:i w:val="0"/>
+          <w:color w:val="000000"/>
+          <w:sz w:val="24"/>
+          <w:rFonts w:ascii="Times New Roman" w:hAnsi="Times New Roman" w:eastAsia="Times New Roman" w:cs="Times New Roman"/>
+        </w:rPr>
+        <w:t>Abstract</w:t>
+      </w:r>
+    </w:p>
+    <w:p>
+      <w:pPr>
+        <w:spacing w:before="0" w:after="60" w:line="300" w:lineRule="auto"/>
+        <w:ind w:firstLine="480"/>
+        <w:jc w:val="both"/>
+      </w:pPr>
+      <w:r>
+        <w:rPr>
+          <w:rFonts w:ascii="Times New Roman" w:hAnsi="Times New Roman"/>
+          <w:b w:val="0"/>
+          <w:i w:val="0"/>
+          <w:color w:val="000000"/>
+          <w:sz w:val="24"/>
+          <w:rFonts w:ascii="Times New Roman" w:hAnsi="Times New Roman" w:eastAsia="宋体" w:cs="Times New Roman"/>
+        </w:rPr>
+        <w:t>The high-penetration integration of wind power imposes rigorous requirements on the day-ahead operating reserve allocation of power systems. Under highly asymmetric penalty schemes, the unit shortage penalty often exceeds tenfold the reserve procurement price, requiring system operators to decisively guard against severe generation dropouts. However, in practical industrial scenarios, telemetry of the blade pitch angle, which is the key parameter reflecting the aerodynamic control transition, is routinely withheld or masked at the control center due to original equipment manufacturer (OEM) commercial firewalls and multi-minute SCADA communication delays. When pitch data is withheld, traditional aerodynamic models experience severe miscalibration, resulting in severe reserve insufficiency (violation rate up to 24.02%). Conversely, end-to-end deep quantile networks, driven by severe asymmetric loss, exhibit pathological conservatism and blindly inject massive reserve volumes to avert penalties, provoking a counter-intuitive 87.2% surge in total assessment cost relative to the physical benchmark.</w:t>
+      </w:r>
+    </w:p>
+    <w:p>
+      <w:pPr>
+        <w:spacing w:before="0" w:after="60" w:line="300" w:lineRule="auto"/>
+        <w:ind w:firstLine="480"/>
+        <w:jc w:val="both"/>
+      </w:pPr>
+      <w:r>
+        <w:rPr>
+          <w:rFonts w:ascii="Times New Roman" w:hAnsi="Times New Roman"/>
+          <w:b w:val="0"/>
+          <w:i w:val="0"/>
+          <w:color w:val="000000"/>
+          <w:sz w:val="24"/>
+          <w:rFonts w:ascii="Times New Roman" w:hAnsi="Times New Roman" w:eastAsia="宋体" w:cs="Times New Roman"/>
+        </w:rPr>
+        <w:t>To overcome this dual failure, this paper proposes an orthogonal two-stage operating reserve decision framework rooted in turbine electromechanical dynamics. We demonstrate that the temporal dynamic response of single-turbine active power effectively inverts the latent pitch control switching, achieving a state identification AUROC of 0.988 without requiring pitch sensors. Building upon this inverse mapping, the proposed framework stage-wise decouples conditional expectation fitting from upper-tail residual quantile estimation. This design eliminates the gradient polarity imbalance of the asymmetric pinball loss on deep representation layers, slashing the total operating cost by 41.9% while strictly respecting grid reliability bounds.</w:t>
+      </w:r>
+    </w:p>
+    <w:p>
+      <w:pPr>
+        <w:spacing w:before="0" w:after="60" w:line="300" w:lineRule="auto"/>
+        <w:ind w:firstLine="480"/>
+        <w:jc w:val="both"/>
+      </w:pPr>
+      <w:r>
+        <w:rPr>
+          <w:rFonts w:ascii="Times New Roman" w:hAnsi="Times New Roman"/>
+          <w:b w:val="0"/>
+          <w:i w:val="0"/>
+          <w:color w:val="000000"/>
+          <w:sz w:val="24"/>
+          <w:rFonts w:ascii="Times New Roman" w:hAnsi="Times New Roman" w:eastAsia="宋体" w:cs="Times New Roman"/>
+        </w:rPr>
+        <w:t>Extensive causal ablations on 134 commercial wind turbines reveal that high-fidelity latent state identification does not entail downstream economic optimality: under steady-state conditions (accounting for 63.8% of operational time), a simple local wind-speed bin quantile baseline decisively outperforms deep neural networks, saving 410,304 kWh in net assessment expenses; under matched-budget constraints, the nominal shortfall reduction of neural models is proven to stem purely from procurement capital redundancy rather than improved spatial risk allocation. Finally, we formulate a minimal sufficient model selection hierarchy across distinct telemetry degradation tiers for modern power systems.</w:t>
+      </w:r>
+    </w:p>
+    <w:p>
+      <w:pPr>
+        <w:spacing w:before="120" w:after="280" w:line="300" w:lineRule="auto"/>
+        <w:ind w:left="480" w:right="480"/>
+        <w:jc w:val="both"/>
+      </w:pPr>
+      <w:r>
+        <w:rPr>
+          <w:rFonts w:ascii="Times New Roman" w:hAnsi="Times New Roman"/>
+          <w:b/>
+          <w:i w:val="0"/>
+          <w:color w:val="000000"/>
+          <w:sz w:val="21"/>
+          <w:rFonts w:ascii="Times New Roman" w:hAnsi="Times New Roman" w:eastAsia="楷体" w:cs="Times New Roman"/>
+        </w:rPr>
+        <w:t>Keywords</w:t>
+      </w:r>
+      <w:r>
+        <w:rPr>
+          <w:rFonts w:ascii="Times New Roman" w:hAnsi="Times New Roman"/>
+          <w:b w:val="0"/>
+          <w:i w:val="0"/>
+          <w:color w:val="000000"/>
+          <w:sz w:val="21"/>
+          <w:rFonts w:ascii="Times New Roman" w:hAnsi="Times New Roman" w:eastAsia="楷体" w:cs="Times New Roman"/>
+        </w:rPr>
+        <w:t>: wind power reserve capacity; asymmetric penalty; SCADA telemetry degradation; latent pitch transitions; two-stage decision-making; minimal sufficient model</w:t>
       </w:r>
     </w:p>
     <w:p>

</xml_diff>

<commit_message>
feat(docx): enable undOvr summation limits for display equations in Word OMML
</commit_message>
<xml_diff>
--- a/manuscript/论文_潜伏控制相变与遥测退化约束下的风电运行备用决策_最小充分模型准则.docx
+++ b/manuscript/论文_潜伏控制相变与遥测退化约束下的风电运行备用决策_最小充分模型准则.docx
@@ -9,7 +9,6 @@
       </w:pPr>
       <w:r>
         <w:rPr>
-          <w:rFonts w:ascii="SimHei" w:hAnsi="SimHei"/>
           <w:b/>
           <w:i w:val="0"/>
           <w:color w:val="000000"/>
@@ -26,7 +25,6 @@
       </w:pPr>
       <w:r>
         <w:rPr>
-          <w:rFonts w:ascii="Times New Roman" w:hAnsi="Times New Roman"/>
           <w:b/>
           <w:i w:val="0"/>
           <w:color w:val="000000"/>
@@ -37,7 +35,6 @@
       </w:r>
       <w:r>
         <w:rPr>
-          <w:rFonts w:ascii="Times New Roman" w:hAnsi="Times New Roman"/>
           <w:b w:val="0"/>
           <w:i w:val="0"/>
           <w:color w:val="000000"/>
@@ -54,7 +51,6 @@
       </w:pPr>
       <w:r>
         <w:rPr>
-          <w:rFonts w:ascii="Times New Roman" w:hAnsi="Times New Roman"/>
           <w:b/>
           <w:i w:val="0"/>
           <w:color w:val="000000"/>
@@ -65,7 +61,6 @@
       </w:r>
       <w:r>
         <w:rPr>
-          <w:rFonts w:ascii="Times New Roman" w:hAnsi="Times New Roman"/>
           <w:b w:val="0"/>
           <w:i w:val="0"/>
           <w:color w:val="000000"/>
@@ -82,7 +77,6 @@
       </w:pPr>
       <w:r>
         <w:rPr>
-          <w:rFonts w:ascii="Times New Roman" w:hAnsi="Times New Roman"/>
           <w:b/>
           <w:i w:val="0"/>
           <w:color w:val="000000"/>
@@ -93,7 +87,6 @@
       </w:r>
       <w:r>
         <w:rPr>
-          <w:rFonts w:ascii="Times New Roman" w:hAnsi="Times New Roman"/>
           <w:b w:val="0"/>
           <w:i w:val="0"/>
           <w:color w:val="000000"/>
@@ -111,7 +104,6 @@
       </w:pPr>
       <w:r>
         <w:rPr>
-          <w:rFonts w:ascii="SimHei" w:hAnsi="SimHei"/>
           <w:b/>
           <w:i w:val="0"/>
           <w:color w:val="000000"/>
@@ -129,7 +121,6 @@
       </w:pPr>
       <w:r>
         <w:rPr>
-          <w:rFonts w:ascii="Times New Roman" w:hAnsi="Times New Roman"/>
           <w:b w:val="0"/>
           <w:i w:val="0"/>
           <w:color w:val="000000"/>
@@ -147,7 +138,6 @@
       </w:pPr>
       <w:r>
         <w:rPr>
-          <w:rFonts w:ascii="Times New Roman" w:hAnsi="Times New Roman"/>
           <w:b w:val="0"/>
           <w:i w:val="0"/>
           <w:color w:val="000000"/>
@@ -165,7 +155,6 @@
       </w:pPr>
       <w:r>
         <w:rPr>
-          <w:rFonts w:ascii="Times New Roman" w:hAnsi="Times New Roman"/>
           <w:b w:val="0"/>
           <w:i w:val="0"/>
           <w:color w:val="000000"/>
@@ -183,7 +172,6 @@
       </w:pPr>
       <w:r>
         <w:rPr>
-          <w:rFonts w:ascii="Times New Roman" w:hAnsi="Times New Roman"/>
           <w:b/>
           <w:i w:val="0"/>
           <w:color w:val="000000"/>
@@ -194,7 +182,6 @@
       </w:r>
       <w:r>
         <w:rPr>
-          <w:rFonts w:ascii="Times New Roman" w:hAnsi="Times New Roman"/>
           <w:b w:val="0"/>
           <w:i w:val="0"/>
           <w:color w:val="000000"/>
@@ -211,7 +198,6 @@
       </w:pPr>
       <w:r>
         <w:rPr>
-          <w:rFonts w:ascii="Times New Roman" w:hAnsi="Times New Roman"/>
           <w:b/>
           <w:i w:val="0"/>
           <w:color w:val="000000"/>
@@ -228,7 +214,6 @@
       </w:pPr>
       <w:r>
         <w:rPr>
-          <w:rFonts w:ascii="Times New Roman" w:hAnsi="Times New Roman"/>
           <w:b/>
           <w:i w:val="0"/>
           <w:color w:val="000000"/>
@@ -239,7 +224,6 @@
       </w:r>
       <w:r>
         <w:rPr>
-          <w:rFonts w:ascii="Times New Roman" w:hAnsi="Times New Roman"/>
           <w:b w:val="0"/>
           <w:i w:val="0"/>
           <w:color w:val="000000"/>
@@ -256,7 +240,6 @@
       </w:pPr>
       <w:r>
         <w:rPr>
-          <w:rFonts w:ascii="Times New Roman" w:hAnsi="Times New Roman"/>
           <w:b/>
           <w:i w:val="0"/>
           <w:color w:val="000000"/>
@@ -267,7 +250,6 @@
       </w:r>
       <w:r>
         <w:rPr>
-          <w:rFonts w:ascii="Times New Roman" w:hAnsi="Times New Roman"/>
           <w:b w:val="0"/>
           <w:i w:val="0"/>
           <w:color w:val="000000"/>
@@ -284,7 +266,6 @@
       </w:pPr>
       <w:r>
         <w:rPr>
-          <w:rFonts w:ascii="Times New Roman" w:hAnsi="Times New Roman"/>
           <w:b/>
           <w:i w:val="0"/>
           <w:color w:val="000000"/>
@@ -295,7 +276,6 @@
       </w:r>
       <w:r>
         <w:rPr>
-          <w:rFonts w:ascii="Times New Roman" w:hAnsi="Times New Roman"/>
           <w:b w:val="0"/>
           <w:i w:val="0"/>
           <w:color w:val="000000"/>
@@ -313,7 +293,6 @@
       </w:pPr>
       <w:r>
         <w:rPr>
-          <w:rFonts w:ascii="Times New Roman" w:hAnsi="Times New Roman"/>
           <w:b/>
           <w:i w:val="0"/>
           <w:color w:val="000000"/>
@@ -331,7 +310,6 @@
       </w:pPr>
       <w:r>
         <w:rPr>
-          <w:rFonts w:ascii="Times New Roman" w:hAnsi="Times New Roman"/>
           <w:b w:val="0"/>
           <w:i w:val="0"/>
           <w:color w:val="000000"/>
@@ -349,7 +327,6 @@
       </w:pPr>
       <w:r>
         <w:rPr>
-          <w:rFonts w:ascii="Times New Roman" w:hAnsi="Times New Roman"/>
           <w:b w:val="0"/>
           <w:i w:val="0"/>
           <w:color w:val="000000"/>
@@ -367,7 +344,6 @@
       </w:pPr>
       <w:r>
         <w:rPr>
-          <w:rFonts w:ascii="Times New Roman" w:hAnsi="Times New Roman"/>
           <w:b w:val="0"/>
           <w:i w:val="0"/>
           <w:color w:val="000000"/>
@@ -385,7 +361,6 @@
       </w:pPr>
       <w:r>
         <w:rPr>
-          <w:rFonts w:ascii="Times New Roman" w:hAnsi="Times New Roman"/>
           <w:b/>
           <w:i w:val="0"/>
           <w:color w:val="000000"/>
@@ -396,7 +371,6 @@
       </w:r>
       <w:r>
         <w:rPr>
-          <w:rFonts w:ascii="Times New Roman" w:hAnsi="Times New Roman"/>
           <w:b w:val="0"/>
           <w:i w:val="0"/>
           <w:color w:val="000000"/>
@@ -414,7 +388,6 @@
       </w:pPr>
       <w:r>
         <w:rPr>
-          <w:rFonts w:ascii="SimHei" w:hAnsi="SimHei"/>
           <w:b/>
           <w:i w:val="0"/>
           <w:color w:val="000000"/>
@@ -432,7 +405,6 @@
       </w:pPr>
       <w:r>
         <w:rPr>
-          <w:rFonts w:ascii="Times New Roman" w:hAnsi="Times New Roman"/>
           <w:b w:val="0"/>
           <w:i w:val="0"/>
           <w:color w:val="000000"/>
@@ -484,7 +456,6 @@
       </m:oMath>
       <w:r>
         <w:rPr>
-          <w:rFonts w:ascii="Times New Roman" w:hAnsi="Times New Roman"/>
           <w:b w:val="0"/>
           <w:i w:val="0"/>
           <w:color w:val="000000"/>
@@ -512,7 +483,6 @@
       </m:oMath>
       <w:r>
         <w:rPr>
-          <w:rFonts w:ascii="Times New Roman" w:hAnsi="Times New Roman"/>
           <w:b w:val="0"/>
           <w:i w:val="0"/>
           <w:color w:val="000000"/>
@@ -530,7 +500,6 @@
       </w:pPr>
       <w:r>
         <w:rPr>
-          <w:rFonts w:ascii="Times New Roman" w:hAnsi="Times New Roman"/>
           <w:b w:val="0"/>
           <w:i w:val="0"/>
           <w:color w:val="000000"/>
@@ -548,7 +517,6 @@
       </w:pPr>
       <w:r>
         <w:rPr>
-          <w:rFonts w:ascii="Times New Roman" w:hAnsi="Times New Roman"/>
           <w:b w:val="0"/>
           <w:i w:val="0"/>
           <w:color w:val="000000"/>
@@ -564,7 +532,6 @@
       </m:oMath>
       <w:r>
         <w:rPr>
-          <w:rFonts w:ascii="Times New Roman" w:hAnsi="Times New Roman"/>
           <w:b w:val="0"/>
           <w:i w:val="0"/>
           <w:color w:val="000000"/>
@@ -582,7 +549,6 @@
       </w:pPr>
       <w:r>
         <w:rPr>
-          <w:rFonts w:ascii="Times New Roman" w:hAnsi="Times New Roman"/>
           <w:b w:val="0"/>
           <w:i w:val="0"/>
           <w:color w:val="000000"/>
@@ -600,7 +566,6 @@
       </w:pPr>
       <w:r>
         <w:rPr>
-          <w:rFonts w:ascii="Times New Roman" w:hAnsi="Times New Roman"/>
           <w:b w:val="0"/>
           <w:i w:val="0"/>
           <w:color w:val="000000"/>
@@ -618,7 +583,6 @@
       </w:pPr>
       <w:r>
         <w:rPr>
-          <w:rFonts w:ascii="Times New Roman" w:hAnsi="Times New Roman"/>
           <w:b w:val="0"/>
           <w:i w:val="0"/>
           <w:color w:val="000000"/>
@@ -636,7 +600,6 @@
       </w:pPr>
       <w:r>
         <w:rPr>
-          <w:rFonts w:ascii="Times New Roman" w:hAnsi="Times New Roman"/>
           <w:b w:val="0"/>
           <w:i w:val="0"/>
           <w:color w:val="000000"/>
@@ -654,7 +617,6 @@
       </w:pPr>
       <w:r>
         <w:rPr>
-          <w:rFonts w:ascii="Times New Roman" w:hAnsi="Times New Roman"/>
           <w:b w:val="0"/>
           <w:i w:val="0"/>
           <w:color w:val="000000"/>
@@ -672,7 +634,6 @@
       </w:pPr>
       <w:r>
         <w:rPr>
-          <w:rFonts w:ascii="Times New Roman" w:hAnsi="Times New Roman"/>
           <w:b w:val="0"/>
           <w:i w:val="0"/>
           <w:color w:val="000000"/>
@@ -690,7 +651,6 @@
       </w:pPr>
       <w:r>
         <w:rPr>
-          <w:rFonts w:ascii="SimHei" w:hAnsi="SimHei"/>
           <w:b/>
           <w:i w:val="0"/>
           <w:color w:val="000000"/>
@@ -708,7 +668,6 @@
       </w:pPr>
       <w:r>
         <w:rPr>
-          <w:rFonts w:ascii="SimHei" w:hAnsi="SimHei"/>
           <w:b/>
           <w:i w:val="0"/>
           <w:color w:val="000000"/>
@@ -726,7 +685,6 @@
       </w:pPr>
       <w:r>
         <w:rPr>
-          <w:rFonts w:ascii="Times New Roman" w:hAnsi="Times New Roman"/>
           <w:b w:val="0"/>
           <w:i w:val="0"/>
           <w:color w:val="000000"/>
@@ -742,7 +700,6 @@
       </m:oMath>
       <w:r>
         <w:rPr>
-          <w:rFonts w:ascii="Times New Roman" w:hAnsi="Times New Roman"/>
           <w:b w:val="0"/>
           <w:i w:val="0"/>
           <w:color w:val="000000"/>
@@ -758,7 +715,6 @@
       </m:oMath>
       <w:r>
         <w:rPr>
-          <w:rFonts w:ascii="Times New Roman" w:hAnsi="Times New Roman"/>
           <w:b w:val="0"/>
           <w:i w:val="0"/>
           <w:color w:val="000000"/>
@@ -774,7 +730,6 @@
       </m:oMath>
       <w:r>
         <w:rPr>
-          <w:rFonts w:ascii="Times New Roman" w:hAnsi="Times New Roman"/>
           <w:b w:val="0"/>
           <w:i w:val="0"/>
           <w:color w:val="000000"/>
@@ -814,7 +769,6 @@
       </m:oMath>
       <w:r>
         <w:rPr>
-          <w:rFonts w:ascii="Times New Roman" w:hAnsi="Times New Roman"/>
           <w:b w:val="0"/>
           <w:i w:val="0"/>
           <w:color w:val="000000"/>
@@ -854,7 +808,6 @@
       </m:oMath>
       <w:r>
         <w:rPr>
-          <w:rFonts w:ascii="Times New Roman" w:hAnsi="Times New Roman"/>
           <w:b w:val="0"/>
           <w:i w:val="0"/>
           <w:color w:val="000000"/>
@@ -887,7 +840,6 @@
       </m:oMath>
       <w:r>
         <w:rPr>
-          <w:rFonts w:ascii="Times New Roman" w:hAnsi="Times New Roman"/>
           <w:b w:val="0"/>
           <w:i w:val="0"/>
           <w:color w:val="000000"/>
@@ -1087,7 +1039,6 @@
             </w:pPr>
             <w:r>
               <w:rPr>
-                <w:rFonts w:ascii="Times New Roman" w:hAnsi="Times New Roman"/>
                 <w:b w:val="0"/>
                 <w:i w:val="0"/>
                 <w:color w:val="000000"/>
@@ -1108,7 +1059,6 @@
       </w:pPr>
       <w:r>
         <w:rPr>
-          <w:rFonts w:ascii="Times New Roman" w:hAnsi="Times New Roman"/>
           <w:b w:val="0"/>
           <w:i w:val="0"/>
           <w:color w:val="000000"/>
@@ -1136,7 +1086,6 @@
       </m:oMath>
       <w:r>
         <w:rPr>
-          <w:rFonts w:ascii="Times New Roman" w:hAnsi="Times New Roman"/>
           <w:b w:val="0"/>
           <w:i w:val="0"/>
           <w:color w:val="000000"/>
@@ -1152,7 +1101,6 @@
       </m:oMath>
       <w:r>
         <w:rPr>
-          <w:rFonts w:ascii="Times New Roman" w:hAnsi="Times New Roman"/>
           <w:b w:val="0"/>
           <w:i w:val="0"/>
           <w:color w:val="000000"/>
@@ -1207,7 +1155,6 @@
       </m:oMath>
       <w:r>
         <w:rPr>
-          <w:rFonts w:ascii="Times New Roman" w:hAnsi="Times New Roman"/>
           <w:b w:val="0"/>
           <w:i w:val="0"/>
           <w:color w:val="000000"/>
@@ -1232,7 +1179,6 @@
       </m:oMath>
       <w:r>
         <w:rPr>
-          <w:rFonts w:ascii="Times New Roman" w:hAnsi="Times New Roman"/>
           <w:b w:val="0"/>
           <w:i w:val="0"/>
           <w:color w:val="000000"/>
@@ -1260,7 +1206,6 @@
       </m:oMath>
       <w:r>
         <w:rPr>
-          <w:rFonts w:ascii="Times New Roman" w:hAnsi="Times New Roman"/>
           <w:b w:val="0"/>
           <w:i w:val="0"/>
           <w:color w:val="000000"/>
@@ -1278,7 +1223,6 @@
       </w:pPr>
       <w:r>
         <w:rPr>
-          <w:rFonts w:ascii="Times New Roman" w:hAnsi="Times New Roman"/>
           <w:b w:val="0"/>
           <w:i w:val="0"/>
           <w:color w:val="000000"/>
@@ -1306,7 +1250,6 @@
       </m:oMath>
       <w:r>
         <w:rPr>
-          <w:rFonts w:ascii="Times New Roman" w:hAnsi="Times New Roman"/>
           <w:b w:val="0"/>
           <w:i w:val="0"/>
           <w:color w:val="000000"/>
@@ -1588,7 +1531,6 @@
             </w:pPr>
             <w:r>
               <w:rPr>
-                <w:rFonts w:ascii="Times New Roman" w:hAnsi="Times New Roman"/>
                 <w:b w:val="0"/>
                 <w:i w:val="0"/>
                 <w:color w:val="000000"/>
@@ -1609,7 +1551,6 @@
       </w:pPr>
       <w:r>
         <w:rPr>
-          <w:rFonts w:ascii="Times New Roman" w:hAnsi="Times New Roman"/>
           <w:b w:val="0"/>
           <w:i w:val="0"/>
           <w:color w:val="000000"/>
@@ -1637,7 +1578,6 @@
       </m:oMath>
       <w:r>
         <w:rPr>
-          <w:rFonts w:ascii="Times New Roman" w:hAnsi="Times New Roman"/>
           <w:b w:val="0"/>
           <w:i w:val="0"/>
           <w:color w:val="000000"/>
@@ -1665,7 +1605,6 @@
       </m:oMath>
       <w:r>
         <w:rPr>
-          <w:rFonts w:ascii="Times New Roman" w:hAnsi="Times New Roman"/>
           <w:b w:val="0"/>
           <w:i w:val="0"/>
           <w:color w:val="000000"/>
@@ -1683,7 +1622,6 @@
       </w:pPr>
       <w:r>
         <w:rPr>
-          <w:rFonts w:ascii="Times New Roman" w:hAnsi="Times New Roman"/>
           <w:b w:val="0"/>
           <w:i w:val="0"/>
           <w:color w:val="000000"/>
@@ -1729,7 +1667,6 @@
       </m:oMath>
       <w:r>
         <w:rPr>
-          <w:rFonts w:ascii="Times New Roman" w:hAnsi="Times New Roman"/>
           <w:b w:val="0"/>
           <w:i w:val="0"/>
           <w:color w:val="000000"/>
@@ -1971,7 +1908,6 @@
             </w:pPr>
             <w:r>
               <w:rPr>
-                <w:rFonts w:ascii="Times New Roman" w:hAnsi="Times New Roman"/>
                 <w:b w:val="0"/>
                 <w:i w:val="0"/>
                 <w:color w:val="000000"/>
@@ -1992,7 +1928,6 @@
       </w:pPr>
       <w:r>
         <w:rPr>
-          <w:rFonts w:ascii="Times New Roman" w:hAnsi="Times New Roman"/>
           <w:b w:val="0"/>
           <w:i w:val="0"/>
           <w:color w:val="000000"/>
@@ -2017,7 +1952,6 @@
       </m:oMath>
       <w:r>
         <w:rPr>
-          <w:rFonts w:ascii="Times New Roman" w:hAnsi="Times New Roman"/>
           <w:b w:val="0"/>
           <w:i w:val="0"/>
           <w:color w:val="000000"/>
@@ -2042,7 +1976,6 @@
       </m:oMath>
       <w:r>
         <w:rPr>
-          <w:rFonts w:ascii="Times New Roman" w:hAnsi="Times New Roman"/>
           <w:b w:val="0"/>
           <w:i w:val="0"/>
           <w:color w:val="000000"/>
@@ -2070,7 +2003,6 @@
       </m:oMath>
       <w:r>
         <w:rPr>
-          <w:rFonts w:ascii="Times New Roman" w:hAnsi="Times New Roman"/>
           <w:b w:val="0"/>
           <w:i w:val="0"/>
           <w:color w:val="000000"/>
@@ -2100,7 +2032,6 @@
       </m:oMath>
       <w:r>
         <w:rPr>
-          <w:rFonts w:ascii="Times New Roman" w:hAnsi="Times New Roman"/>
           <w:b w:val="0"/>
           <w:i w:val="0"/>
           <w:color w:val="000000"/>
@@ -2118,7 +2049,6 @@
       </w:pPr>
       <w:r>
         <w:rPr>
-          <w:rFonts w:ascii="Times New Roman" w:hAnsi="Times New Roman"/>
           <w:b w:val="0"/>
           <w:i w:val="0"/>
           <w:color w:val="000000"/>
@@ -2372,7 +2302,6 @@
             </w:pPr>
             <w:r>
               <w:rPr>
-                <w:rFonts w:ascii="Times New Roman" w:hAnsi="Times New Roman"/>
                 <w:b w:val="0"/>
                 <w:i w:val="0"/>
                 <w:color w:val="000000"/>
@@ -2393,7 +2322,6 @@
       </w:pPr>
       <w:r>
         <w:rPr>
-          <w:rFonts w:ascii="Times New Roman" w:hAnsi="Times New Roman"/>
           <w:b w:val="0"/>
           <w:i w:val="0"/>
           <w:color w:val="000000"/>
@@ -2409,7 +2337,6 @@
       </m:oMath>
       <w:r>
         <w:rPr>
-          <w:rFonts w:ascii="Times New Roman" w:hAnsi="Times New Roman"/>
           <w:b w:val="0"/>
           <w:i w:val="0"/>
           <w:color w:val="000000"/>
@@ -2425,7 +2352,6 @@
       </m:oMath>
       <w:r>
         <w:rPr>
-          <w:rFonts w:ascii="Times New Roman" w:hAnsi="Times New Roman"/>
           <w:b w:val="0"/>
           <w:i w:val="0"/>
           <w:color w:val="000000"/>
@@ -2443,7 +2369,6 @@
       </w:pPr>
       <w:r>
         <w:rPr>
-          <w:rFonts w:ascii="SimHei" w:hAnsi="SimHei"/>
           <w:b/>
           <w:i w:val="0"/>
           <w:color w:val="000000"/>
@@ -2461,7 +2386,6 @@
       </w:pPr>
       <w:r>
         <w:rPr>
-          <w:rFonts w:ascii="Times New Roman" w:hAnsi="Times New Roman"/>
           <w:b w:val="0"/>
           <w:i w:val="0"/>
           <w:color w:val="000000"/>
@@ -2479,7 +2403,6 @@
       </w:pPr>
       <w:r>
         <w:rPr>
-          <w:rFonts w:ascii="Times New Roman" w:hAnsi="Times New Roman"/>
           <w:b w:val="0"/>
           <w:i w:val="0"/>
           <w:color w:val="000000"/>
@@ -2490,7 +2413,6 @@
       </w:r>
       <w:r>
         <w:rPr>
-          <w:rFonts w:ascii="Times New Roman" w:hAnsi="Times New Roman"/>
           <w:b/>
           <w:i w:val="0"/>
           <w:color w:val="000000"/>
@@ -2501,7 +2423,6 @@
       </w:r>
       <w:r>
         <w:rPr>
-          <w:rFonts w:ascii="Times New Roman" w:hAnsi="Times New Roman"/>
           <w:b w:val="0"/>
           <w:i w:val="0"/>
           <w:color w:val="000000"/>
@@ -2668,7 +2589,6 @@
             </w:pPr>
             <w:r>
               <w:rPr>
-                <w:rFonts w:ascii="Times New Roman" w:hAnsi="Times New Roman"/>
                 <w:b w:val="0"/>
                 <w:i w:val="0"/>
                 <w:color w:val="000000"/>
@@ -2689,7 +2609,6 @@
       </w:pPr>
       <w:r>
         <w:rPr>
-          <w:rFonts w:ascii="Times New Roman" w:hAnsi="Times New Roman"/>
           <w:b w:val="0"/>
           <w:i w:val="0"/>
           <w:color w:val="000000"/>
@@ -2700,7 +2619,6 @@
       </w:r>
       <w:r>
         <w:rPr>
-          <w:rFonts w:ascii="Times New Roman" w:hAnsi="Times New Roman"/>
           <w:b/>
           <w:i w:val="0"/>
           <w:color w:val="000000"/>
@@ -2711,7 +2629,6 @@
       </w:r>
       <w:r>
         <w:rPr>
-          <w:rFonts w:ascii="Times New Roman" w:hAnsi="Times New Roman"/>
           <w:b w:val="0"/>
           <w:i w:val="0"/>
           <w:color w:val="000000"/>
@@ -2748,7 +2665,6 @@
       </m:oMath>
       <w:r>
         <w:rPr>
-          <w:rFonts w:ascii="Times New Roman" w:hAnsi="Times New Roman"/>
           <w:b w:val="0"/>
           <w:i w:val="0"/>
           <w:color w:val="000000"/>
@@ -2960,7 +2876,6 @@
             </w:pPr>
             <w:r>
               <w:rPr>
-                <w:rFonts w:ascii="Times New Roman" w:hAnsi="Times New Roman"/>
                 <w:b w:val="0"/>
                 <w:i w:val="0"/>
                 <w:color w:val="000000"/>
@@ -2981,7 +2896,6 @@
       </w:pPr>
       <w:r>
         <w:rPr>
-          <w:rFonts w:ascii="Times New Roman" w:hAnsi="Times New Roman"/>
           <w:b w:val="0"/>
           <w:i w:val="0"/>
           <w:color w:val="000000"/>
@@ -2992,7 +2906,6 @@
       </w:r>
       <w:r>
         <w:rPr>
-          <w:rFonts w:ascii="Times New Roman" w:hAnsi="Times New Roman"/>
           <w:b/>
           <w:i w:val="0"/>
           <w:color w:val="000000"/>
@@ -3003,7 +2916,6 @@
       </w:r>
       <w:r>
         <w:rPr>
-          <w:rFonts w:ascii="Times New Roman" w:hAnsi="Times New Roman"/>
           <w:b w:val="0"/>
           <w:i w:val="0"/>
           <w:color w:val="000000"/>
@@ -3264,7 +3176,6 @@
             </w:pPr>
             <w:r>
               <w:rPr>
-                <w:rFonts w:ascii="Times New Roman" w:hAnsi="Times New Roman"/>
                 <w:b w:val="0"/>
                 <w:i w:val="0"/>
                 <w:color w:val="000000"/>
@@ -3285,7 +3196,6 @@
       </w:pPr>
       <w:r>
         <w:rPr>
-          <w:rFonts w:ascii="Times New Roman" w:hAnsi="Times New Roman"/>
           <w:b w:val="0"/>
           <w:i w:val="0"/>
           <w:color w:val="000000"/>
@@ -3310,7 +3220,6 @@
       </m:oMath>
       <w:r>
         <w:rPr>
-          <w:rFonts w:ascii="Times New Roman" w:hAnsi="Times New Roman"/>
           <w:b w:val="0"/>
           <w:i w:val="0"/>
           <w:color w:val="000000"/>
@@ -3328,7 +3237,6 @@
       </w:pPr>
       <w:r>
         <w:rPr>
-          <w:rFonts w:ascii="SimHei" w:hAnsi="SimHei"/>
           <w:b/>
           <w:i w:val="0"/>
           <w:color w:val="000000"/>
@@ -3346,7 +3254,6 @@
       </w:pPr>
       <w:r>
         <w:rPr>
-          <w:rFonts w:ascii="Times New Roman" w:hAnsi="Times New Roman"/>
           <w:b w:val="0"/>
           <w:i w:val="0"/>
           <w:color w:val="000000"/>
@@ -3362,7 +3269,6 @@
       </m:oMath>
       <w:r>
         <w:rPr>
-          <w:rFonts w:ascii="Times New Roman" w:hAnsi="Times New Roman"/>
           <w:b w:val="0"/>
           <w:i w:val="0"/>
           <w:color w:val="000000"/>
@@ -3378,7 +3284,6 @@
       </m:oMath>
       <w:r>
         <w:rPr>
-          <w:rFonts w:ascii="Times New Roman" w:hAnsi="Times New Roman"/>
           <w:b w:val="0"/>
           <w:i w:val="0"/>
           <w:color w:val="000000"/>
@@ -3438,7 +3343,6 @@
       </m:oMath>
       <w:r>
         <w:rPr>
-          <w:rFonts w:ascii="Times New Roman" w:hAnsi="Times New Roman"/>
           <w:b w:val="0"/>
           <w:i w:val="0"/>
           <w:color w:val="000000"/>
@@ -3470,7 +3374,6 @@
       </m:oMath>
       <w:r>
         <w:rPr>
-          <w:rFonts w:ascii="Times New Roman" w:hAnsi="Times New Roman"/>
           <w:b w:val="0"/>
           <w:i w:val="0"/>
           <w:color w:val="000000"/>
@@ -3498,7 +3401,6 @@
       </m:oMath>
       <w:r>
         <w:rPr>
-          <w:rFonts w:ascii="Times New Roman" w:hAnsi="Times New Roman"/>
           <w:b w:val="0"/>
           <w:i w:val="0"/>
           <w:color w:val="000000"/>
@@ -3516,7 +3418,6 @@
       </w:pPr>
       <w:r>
         <w:rPr>
-          <w:rFonts w:ascii="Times New Roman" w:hAnsi="Times New Roman"/>
           <w:b w:val="0"/>
           <w:i w:val="0"/>
           <w:color w:val="000000"/>
@@ -3578,7 +3479,6 @@
       </m:oMath>
       <w:r>
         <w:rPr>
-          <w:rFonts w:ascii="Times New Roman" w:hAnsi="Times New Roman"/>
           <w:b w:val="0"/>
           <w:i w:val="0"/>
           <w:color w:val="000000"/>
@@ -3727,7 +3627,6 @@
             </w:pPr>
             <w:r>
               <w:rPr>
-                <w:rFonts w:ascii="Times New Roman" w:hAnsi="Times New Roman"/>
                 <w:b w:val="0"/>
                 <w:i w:val="0"/>
                 <w:color w:val="000000"/>
@@ -3748,7 +3647,6 @@
       </w:pPr>
       <w:r>
         <w:rPr>
-          <w:rFonts w:ascii="Times New Roman" w:hAnsi="Times New Roman"/>
           <w:b w:val="0"/>
           <w:i w:val="0"/>
           <w:color w:val="000000"/>
@@ -3981,7 +3879,6 @@
             </w:pPr>
             <w:r>
               <w:rPr>
-                <w:rFonts w:ascii="Times New Roman" w:hAnsi="Times New Roman"/>
                 <w:b w:val="0"/>
                 <w:i w:val="0"/>
                 <w:color w:val="000000"/>
@@ -4002,7 +3899,6 @@
       </w:pPr>
       <w:r>
         <w:rPr>
-          <w:rFonts w:ascii="Times New Roman" w:hAnsi="Times New Roman"/>
           <w:b w:val="0"/>
           <w:i w:val="0"/>
           <w:color w:val="000000"/>
@@ -4033,7 +3929,6 @@
       </m:oMath>
       <w:r>
         <w:rPr>
-          <w:rFonts w:ascii="Times New Roman" w:hAnsi="Times New Roman"/>
           <w:b w:val="0"/>
           <w:i w:val="0"/>
           <w:color w:val="000000"/>
@@ -4049,7 +3944,6 @@
       </m:oMath>
       <w:r>
         <w:rPr>
-          <w:rFonts w:ascii="Times New Roman" w:hAnsi="Times New Roman"/>
           <w:b w:val="0"/>
           <w:i w:val="0"/>
           <w:color w:val="000000"/>
@@ -4067,7 +3961,6 @@
       </w:pPr>
       <w:r>
         <w:rPr>
-          <w:rFonts w:ascii="Times New Roman" w:hAnsi="Times New Roman"/>
           <w:b w:val="0"/>
           <w:i w:val="0"/>
           <w:color w:val="000000"/>
@@ -4129,7 +4022,6 @@
       </m:oMath>
       <w:r>
         <w:rPr>
-          <w:rFonts w:ascii="Times New Roman" w:hAnsi="Times New Roman"/>
           <w:b w:val="0"/>
           <w:i w:val="0"/>
           <w:color w:val="000000"/>
@@ -4181,7 +4073,6 @@
       </m:oMath>
       <w:r>
         <w:rPr>
-          <w:rFonts w:ascii="Times New Roman" w:hAnsi="Times New Roman"/>
           <w:b w:val="0"/>
           <w:i w:val="0"/>
           <w:color w:val="000000"/>
@@ -4211,7 +4102,6 @@
       </m:oMath>
       <w:r>
         <w:rPr>
-          <w:rFonts w:ascii="Times New Roman" w:hAnsi="Times New Roman"/>
           <w:b w:val="0"/>
           <w:i w:val="0"/>
           <w:color w:val="000000"/>
@@ -4386,7 +4276,6 @@
             </w:pPr>
             <w:r>
               <w:rPr>
-                <w:rFonts w:ascii="Times New Roman" w:hAnsi="Times New Roman"/>
                 <w:b w:val="0"/>
                 <w:i w:val="0"/>
                 <w:color w:val="000000"/>
@@ -4407,7 +4296,6 @@
       </w:pPr>
       <w:r>
         <w:rPr>
-          <w:rFonts w:ascii="Times New Roman" w:hAnsi="Times New Roman"/>
           <w:b w:val="0"/>
           <w:i w:val="0"/>
           <w:color w:val="000000"/>
@@ -4595,7 +4483,6 @@
             </w:pPr>
             <w:r>
               <w:rPr>
-                <w:rFonts w:ascii="Times New Roman" w:hAnsi="Times New Roman"/>
                 <w:b w:val="0"/>
                 <w:i w:val="0"/>
                 <w:color w:val="000000"/>
@@ -4616,7 +4503,6 @@
       </w:pPr>
       <w:r>
         <w:rPr>
-          <w:rFonts w:ascii="Times New Roman" w:hAnsi="Times New Roman"/>
           <w:b w:val="0"/>
           <w:i w:val="0"/>
           <w:color w:val="000000"/>
@@ -4647,7 +4533,6 @@
       </m:oMath>
       <w:r>
         <w:rPr>
-          <w:rFonts w:ascii="Times New Roman" w:hAnsi="Times New Roman"/>
           <w:b w:val="0"/>
           <w:i w:val="0"/>
           <w:color w:val="000000"/>
@@ -4665,7 +4550,6 @@
       </w:pPr>
       <w:r>
         <w:rPr>
-          <w:rFonts w:ascii="SimHei" w:hAnsi="SimHei"/>
           <w:b/>
           <w:i w:val="0"/>
           <w:color w:val="000000"/>
@@ -4683,7 +4567,6 @@
       </w:pPr>
       <w:r>
         <w:rPr>
-          <w:rFonts w:ascii="SimHei" w:hAnsi="SimHei"/>
           <w:b/>
           <w:i w:val="0"/>
           <w:color w:val="000000"/>
@@ -4701,7 +4584,6 @@
       </w:pPr>
       <w:r>
         <w:rPr>
-          <w:rFonts w:ascii="Times New Roman" w:hAnsi="Times New Roman"/>
           <w:b w:val="0"/>
           <w:i w:val="0"/>
           <w:color w:val="000000"/>
@@ -4726,7 +4608,6 @@
       </m:oMath>
       <w:r>
         <w:rPr>
-          <w:rFonts w:ascii="Times New Roman" w:hAnsi="Times New Roman"/>
           <w:b w:val="0"/>
           <w:i w:val="0"/>
           <w:color w:val="000000"/>
@@ -4742,7 +4623,6 @@
       </m:oMath>
       <w:r>
         <w:rPr>
-          <w:rFonts w:ascii="Times New Roman" w:hAnsi="Times New Roman"/>
           <w:b w:val="0"/>
           <w:i w:val="0"/>
           <w:color w:val="000000"/>
@@ -4758,7 +4638,6 @@
       </m:oMath>
       <w:r>
         <w:rPr>
-          <w:rFonts w:ascii="Times New Roman" w:hAnsi="Times New Roman"/>
           <w:b w:val="0"/>
           <w:i w:val="0"/>
           <w:color w:val="000000"/>
@@ -4776,7 +4655,6 @@
       </w:pPr>
       <w:r>
         <w:rPr>
-          <w:rFonts w:ascii="Times New Roman" w:hAnsi="Times New Roman"/>
           <w:b w:val="0"/>
           <w:i w:val="0"/>
           <w:color w:val="000000"/>
@@ -4801,7 +4679,6 @@
       </m:oMath>
       <w:r>
         <w:rPr>
-          <w:rFonts w:ascii="Times New Roman" w:hAnsi="Times New Roman"/>
           <w:b w:val="0"/>
           <w:i w:val="0"/>
           <w:color w:val="000000"/>
@@ -4834,7 +4711,6 @@
       </m:oMath>
       <w:r>
         <w:rPr>
-          <w:rFonts w:ascii="Times New Roman" w:hAnsi="Times New Roman"/>
           <w:b w:val="0"/>
           <w:i w:val="0"/>
           <w:color w:val="000000"/>
@@ -4914,7 +4790,7 @@
               <m:nary>
                 <m:naryPr>
                   <m:chr m:val="∑"/>
-                  <m:limLoc m:val="subSup"/>
+                  <m:limLoc m:val="undOvr"/>
                   <m:grow m:val="1"/>
                   <m:subHide m:val="off"/>
                   <m:supHide m:val="off"/>
@@ -4934,7 +4810,7 @@
               <m:nary>
                 <m:naryPr>
                   <m:chr m:val="∑"/>
-                  <m:limLoc m:val="subSup"/>
+                  <m:limLoc m:val="undOvr"/>
                   <m:grow m:val="1"/>
                   <m:subHide m:val="off"/>
                   <m:supHide m:val="off"/>
@@ -5066,7 +4942,6 @@
             </w:pPr>
             <w:r>
               <w:rPr>
-                <w:rFonts w:ascii="Times New Roman" w:hAnsi="Times New Roman"/>
                 <w:b w:val="0"/>
                 <w:i w:val="0"/>
                 <w:color w:val="000000"/>
@@ -5087,7 +4962,6 @@
       </w:pPr>
       <w:r>
         <w:rPr>
-          <w:rFonts w:ascii="Times New Roman" w:hAnsi="Times New Roman"/>
           <w:b w:val="0"/>
           <w:i w:val="0"/>
           <w:color w:val="000000"/>
@@ -5153,7 +5027,6 @@
       </m:oMath>
       <w:r>
         <w:rPr>
-          <w:rFonts w:ascii="Times New Roman" w:hAnsi="Times New Roman"/>
           <w:b w:val="0"/>
           <w:i w:val="0"/>
           <w:color w:val="000000"/>
@@ -5175,7 +5048,6 @@
       </m:oMath>
       <w:r>
         <w:rPr>
-          <w:rFonts w:ascii="Times New Roman" w:hAnsi="Times New Roman"/>
           <w:b w:val="0"/>
           <w:i w:val="0"/>
           <w:color w:val="000000"/>
@@ -5193,7 +5065,6 @@
       </w:pPr>
       <w:r>
         <w:rPr>
-          <w:rFonts w:ascii="SimHei" w:hAnsi="SimHei"/>
           <w:b/>
           <w:i w:val="0"/>
           <w:color w:val="000000"/>
@@ -5211,7 +5082,6 @@
       </w:pPr>
       <w:r>
         <w:rPr>
-          <w:rFonts w:ascii="Times New Roman" w:hAnsi="Times New Roman"/>
           <w:b w:val="0"/>
           <w:i w:val="0"/>
           <w:color w:val="000000"/>
@@ -5227,7 +5097,6 @@
       </m:oMath>
       <w:r>
         <w:rPr>
-          <w:rFonts w:ascii="Times New Roman" w:hAnsi="Times New Roman"/>
           <w:b w:val="0"/>
           <w:i w:val="0"/>
           <w:color w:val="000000"/>
@@ -5243,7 +5112,6 @@
       </m:oMath>
       <w:r>
         <w:rPr>
-          <w:rFonts w:ascii="Times New Roman" w:hAnsi="Times New Roman"/>
           <w:b w:val="0"/>
           <w:i w:val="0"/>
           <w:color w:val="000000"/>
@@ -5457,7 +5325,6 @@
             </w:pPr>
             <w:r>
               <w:rPr>
-                <w:rFonts w:ascii="Times New Roman" w:hAnsi="Times New Roman"/>
                 <w:b w:val="0"/>
                 <w:i w:val="0"/>
                 <w:color w:val="000000"/>
@@ -5478,7 +5345,6 @@
       </w:pPr>
       <w:r>
         <w:rPr>
-          <w:rFonts w:ascii="Times New Roman" w:hAnsi="Times New Roman"/>
           <w:b w:val="0"/>
           <w:i w:val="0"/>
           <w:color w:val="000000"/>
@@ -5496,7 +5362,6 @@
       </w:pPr>
       <w:r>
         <w:rPr>
-          <w:rFonts w:ascii="Times New Roman" w:hAnsi="Times New Roman"/>
           <w:b w:val="0"/>
           <w:i w:val="0"/>
           <w:color w:val="000000"/>
@@ -5514,7 +5379,6 @@
       </w:pPr>
       <w:r>
         <w:rPr>
-          <w:rFonts w:ascii="Times New Roman" w:hAnsi="Times New Roman"/>
           <w:b w:val="0"/>
           <w:i w:val="0"/>
           <w:color w:val="000000"/>
@@ -5539,7 +5403,6 @@
       </m:oMath>
       <w:r>
         <w:rPr>
-          <w:rFonts w:ascii="Times New Roman" w:hAnsi="Times New Roman"/>
           <w:b w:val="0"/>
           <w:i w:val="0"/>
           <w:color w:val="000000"/>
@@ -5631,7 +5494,7 @@
               <m:nary>
                 <m:naryPr>
                   <m:chr m:val="∑"/>
-                  <m:limLoc m:val="subSup"/>
+                  <m:limLoc m:val="undOvr"/>
                   <m:grow m:val="1"/>
                   <m:subHide m:val="off"/>
                   <m:supHide m:val="off"/>
@@ -5651,7 +5514,7 @@
               <m:nary>
                 <m:naryPr>
                   <m:chr m:val="∑"/>
-                  <m:limLoc m:val="subSup"/>
+                  <m:limLoc m:val="undOvr"/>
                   <m:grow m:val="1"/>
                   <m:subHide m:val="off"/>
                   <m:supHide m:val="off"/>
@@ -5759,7 +5622,6 @@
             </w:pPr>
             <w:r>
               <w:rPr>
-                <w:rFonts w:ascii="Times New Roman" w:hAnsi="Times New Roman"/>
                 <w:b w:val="0"/>
                 <w:i w:val="0"/>
                 <w:color w:val="000000"/>
@@ -5780,7 +5642,6 @@
       </w:pPr>
       <w:r>
         <w:rPr>
-          <w:rFonts w:ascii="Times New Roman" w:hAnsi="Times New Roman"/>
           <w:b w:val="0"/>
           <w:i w:val="0"/>
           <w:color w:val="000000"/>
@@ -5798,7 +5659,6 @@
       </w:pPr>
       <w:r>
         <w:rPr>
-          <w:rFonts w:ascii="Times New Roman" w:hAnsi="Times New Roman"/>
           <w:b w:val="0"/>
           <w:i w:val="0"/>
           <w:color w:val="000000"/>
@@ -5814,7 +5674,6 @@
       </m:oMath>
       <w:r>
         <w:rPr>
-          <w:rFonts w:ascii="Times New Roman" w:hAnsi="Times New Roman"/>
           <w:b w:val="0"/>
           <w:i w:val="0"/>
           <w:color w:val="000000"/>
@@ -5879,7 +5738,6 @@
       </m:oMath>
       <w:r>
         <w:rPr>
-          <w:rFonts w:ascii="Times New Roman" w:hAnsi="Times New Roman"/>
           <w:b w:val="0"/>
           <w:i w:val="0"/>
           <w:color w:val="000000"/>
@@ -5904,7 +5762,6 @@
       </m:oMath>
       <w:r>
         <w:rPr>
-          <w:rFonts w:ascii="Times New Roman" w:hAnsi="Times New Roman"/>
           <w:b w:val="0"/>
           <w:i w:val="0"/>
           <w:color w:val="000000"/>
@@ -5929,7 +5786,6 @@
       </m:oMath>
       <w:r>
         <w:rPr>
-          <w:rFonts w:ascii="Times New Roman" w:hAnsi="Times New Roman"/>
           <w:b w:val="0"/>
           <w:i w:val="0"/>
           <w:color w:val="000000"/>
@@ -6003,7 +5859,7 @@
               <m:nary>
                 <m:naryPr>
                   <m:chr m:val="∑"/>
-                  <m:limLoc m:val="subSup"/>
+                  <m:limLoc m:val="undOvr"/>
                   <m:grow m:val="1"/>
                   <m:subHide m:val="off"/>
                   <m:supHide m:val="off"/>
@@ -6151,7 +6007,6 @@
             </w:pPr>
             <w:r>
               <w:rPr>
-                <w:rFonts w:ascii="Times New Roman" w:hAnsi="Times New Roman"/>
                 <w:b w:val="0"/>
                 <w:i w:val="0"/>
                 <w:color w:val="000000"/>
@@ -6172,7 +6027,6 @@
       </w:pPr>
       <w:r>
         <w:rPr>
-          <w:rFonts w:ascii="Times New Roman" w:hAnsi="Times New Roman"/>
           <w:b w:val="0"/>
           <w:i w:val="0"/>
           <w:color w:val="000000"/>
@@ -6245,7 +6099,6 @@
       </m:oMath>
       <w:r>
         <w:rPr>
-          <w:rFonts w:ascii="Times New Roman" w:hAnsi="Times New Roman"/>
           <w:b w:val="0"/>
           <w:i w:val="0"/>
           <w:color w:val="000000"/>
@@ -6263,7 +6116,6 @@
       </w:pPr>
       <w:r>
         <w:rPr>
-          <w:rFonts w:ascii="Times New Roman" w:hAnsi="Times New Roman"/>
           <w:b w:val="0"/>
           <w:i w:val="0"/>
           <w:color w:val="000000"/>
@@ -6281,7 +6133,6 @@
       </w:pPr>
       <w:r>
         <w:rPr>
-          <w:rFonts w:ascii="Times New Roman" w:hAnsi="Times New Roman"/>
           <w:b w:val="0"/>
           <w:i w:val="0"/>
           <w:color w:val="000000"/>
@@ -6339,7 +6190,6 @@
       </w:pPr>
       <w:r>
         <w:rPr>
-          <w:rFonts w:ascii="Times New Roman" w:hAnsi="Times New Roman"/>
           <w:b/>
           <w:i w:val="0"/>
           <w:color w:val="000000"/>
@@ -6350,7 +6200,6 @@
       </w:r>
       <w:r>
         <w:rPr>
-          <w:rFonts w:ascii="Times New Roman" w:hAnsi="Times New Roman"/>
           <w:b/>
           <w:i w:val="0"/>
           <w:color w:val="000000"/>
@@ -6368,7 +6217,6 @@
       </w:pPr>
       <w:r>
         <w:rPr>
-          <w:rFonts w:ascii="SimHei" w:hAnsi="SimHei"/>
           <w:b/>
           <w:i w:val="0"/>
           <w:color w:val="000000"/>
@@ -6386,7 +6234,6 @@
       </w:pPr>
       <w:r>
         <w:rPr>
-          <w:rFonts w:ascii="SimHei" w:hAnsi="SimHei"/>
           <w:b/>
           <w:i w:val="0"/>
           <w:color w:val="000000"/>
@@ -6404,7 +6251,6 @@
       </w:pPr>
       <w:r>
         <w:rPr>
-          <w:rFonts w:ascii="Times New Roman" w:hAnsi="Times New Roman"/>
           <w:b w:val="0"/>
           <w:i w:val="0"/>
           <w:color w:val="000000"/>
@@ -6422,7 +6268,6 @@
       </w:pPr>
       <w:r>
         <w:rPr>
-          <w:rFonts w:ascii="Times New Roman" w:hAnsi="Times New Roman"/>
           <w:b w:val="0"/>
           <w:i w:val="0"/>
           <w:color w:val="000000"/>
@@ -6438,7 +6283,6 @@
       </m:oMath>
       <w:r>
         <w:rPr>
-          <w:rFonts w:ascii="Times New Roman" w:hAnsi="Times New Roman"/>
           <w:b w:val="0"/>
           <w:i w:val="0"/>
           <w:color w:val="000000"/>
@@ -6454,7 +6298,6 @@
       </m:oMath>
       <w:r>
         <w:rPr>
-          <w:rFonts w:ascii="Times New Roman" w:hAnsi="Times New Roman"/>
           <w:b w:val="0"/>
           <w:i w:val="0"/>
           <w:color w:val="000000"/>
@@ -6472,7 +6315,6 @@
       </w:pPr>
       <w:r>
         <w:rPr>
-          <w:rFonts w:ascii="Times New Roman" w:hAnsi="Times New Roman"/>
           <w:b w:val="0"/>
           <w:i w:val="0"/>
           <w:color w:val="000000"/>
@@ -6500,7 +6342,6 @@
       </m:oMath>
       <w:r>
         <w:rPr>
-          <w:rFonts w:ascii="Times New Roman" w:hAnsi="Times New Roman"/>
           <w:b w:val="0"/>
           <w:i w:val="0"/>
           <w:color w:val="000000"/>
@@ -6528,7 +6369,6 @@
       </m:oMath>
       <w:r>
         <w:rPr>
-          <w:rFonts w:ascii="Times New Roman" w:hAnsi="Times New Roman"/>
           <w:b w:val="0"/>
           <w:i w:val="0"/>
           <w:color w:val="000000"/>
@@ -6556,7 +6396,6 @@
       </m:oMath>
       <w:r>
         <w:rPr>
-          <w:rFonts w:ascii="Times New Roman" w:hAnsi="Times New Roman"/>
           <w:b w:val="0"/>
           <w:i w:val="0"/>
           <w:color w:val="000000"/>
@@ -6572,7 +6411,6 @@
       </m:oMath>
       <w:r>
         <w:rPr>
-          <w:rFonts w:ascii="Times New Roman" w:hAnsi="Times New Roman"/>
           <w:b w:val="0"/>
           <w:i w:val="0"/>
           <w:color w:val="000000"/>
@@ -6588,7 +6426,6 @@
       </m:oMath>
       <w:r>
         <w:rPr>
-          <w:rFonts w:ascii="Times New Roman" w:hAnsi="Times New Roman"/>
           <w:b w:val="0"/>
           <w:i w:val="0"/>
           <w:color w:val="000000"/>
@@ -6604,7 +6441,6 @@
       </m:oMath>
       <w:r>
         <w:rPr>
-          <w:rFonts w:ascii="Times New Roman" w:hAnsi="Times New Roman"/>
           <w:b w:val="0"/>
           <w:i w:val="0"/>
           <w:color w:val="000000"/>
@@ -6622,7 +6458,6 @@
       </w:pPr>
       <w:r>
         <w:rPr>
-          <w:rFonts w:ascii="Times New Roman" w:hAnsi="Times New Roman"/>
           <w:b w:val="0"/>
           <w:i w:val="0"/>
           <w:color w:val="000000"/>
@@ -6680,7 +6515,6 @@
       </w:pPr>
       <w:r>
         <w:rPr>
-          <w:rFonts w:ascii="Times New Roman" w:hAnsi="Times New Roman"/>
           <w:b/>
           <w:i w:val="0"/>
           <w:color w:val="000000"/>
@@ -6691,7 +6525,6 @@
       </w:r>
       <w:r>
         <w:rPr>
-          <w:rFonts w:ascii="Times New Roman" w:hAnsi="Times New Roman"/>
           <w:b/>
           <w:i w:val="0"/>
           <w:color w:val="000000"/>
@@ -6709,7 +6542,6 @@
       </w:pPr>
       <w:r>
         <w:rPr>
-          <w:rFonts w:ascii="SimHei" w:hAnsi="SimHei"/>
           <w:b/>
           <w:i w:val="0"/>
           <w:color w:val="000000"/>
@@ -6727,7 +6559,6 @@
       </w:pPr>
       <w:r>
         <w:rPr>
-          <w:rFonts w:ascii="Times New Roman" w:hAnsi="Times New Roman"/>
           <w:b w:val="0"/>
           <w:i w:val="0"/>
           <w:color w:val="000000"/>
@@ -6743,7 +6574,6 @@
       </m:oMath>
       <w:r>
         <w:rPr>
-          <w:rFonts w:ascii="Times New Roman" w:hAnsi="Times New Roman"/>
           <w:b w:val="0"/>
           <w:i w:val="0"/>
           <w:color w:val="000000"/>
@@ -6761,7 +6591,6 @@
       </w:pPr>
       <w:r>
         <w:rPr>
-          <w:rFonts w:ascii="Times New Roman" w:hAnsi="Times New Roman"/>
           <w:b/>
           <w:i w:val="0"/>
           <w:color w:val="000000"/>
@@ -6772,7 +6601,6 @@
       </w:r>
       <w:r>
         <w:rPr>
-          <w:rFonts w:ascii="Times New Roman" w:hAnsi="Times New Roman"/>
           <w:b/>
           <w:i w:val="0"/>
           <w:color w:val="000000"/>
@@ -6788,7 +6616,6 @@
       </m:oMath>
       <w:r>
         <w:rPr>
-          <w:rFonts w:ascii="Times New Roman" w:hAnsi="Times New Roman"/>
           <w:b/>
           <w:i w:val="0"/>
           <w:color w:val="000000"/>
@@ -6839,7 +6666,6 @@
             <w:r/>
             <w:r>
               <w:rPr>
-                <w:rFonts w:ascii="Times New Roman" w:hAnsi="Times New Roman"/>
                 <w:b/>
                 <w:i w:val="0"/>
                 <w:color w:val="000000"/>
@@ -6874,7 +6700,6 @@
             <w:r/>
             <w:r>
               <w:rPr>
-                <w:rFonts w:ascii="Times New Roman" w:hAnsi="Times New Roman"/>
                 <w:b/>
                 <w:i w:val="0"/>
                 <w:color w:val="000000"/>
@@ -6909,7 +6734,6 @@
             <w:r/>
             <w:r>
               <w:rPr>
-                <w:rFonts w:ascii="Times New Roman" w:hAnsi="Times New Roman"/>
                 <w:b/>
                 <w:i w:val="0"/>
                 <w:color w:val="000000"/>
@@ -6944,7 +6768,6 @@
             <w:r/>
             <w:r>
               <w:rPr>
-                <w:rFonts w:ascii="Times New Roman" w:hAnsi="Times New Roman"/>
                 <w:b/>
                 <w:i w:val="0"/>
                 <w:color w:val="000000"/>
@@ -6979,7 +6802,6 @@
             <w:r/>
             <w:r>
               <w:rPr>
-                <w:rFonts w:ascii="Times New Roman" w:hAnsi="Times New Roman"/>
                 <w:b/>
                 <w:i w:val="0"/>
                 <w:color w:val="000000"/>
@@ -7014,7 +6836,6 @@
             <w:r/>
             <w:r>
               <w:rPr>
-                <w:rFonts w:ascii="Times New Roman" w:hAnsi="Times New Roman"/>
                 <w:b/>
                 <w:i w:val="0"/>
                 <w:color w:val="000000"/>
@@ -7049,7 +6870,6 @@
             <w:r/>
             <w:r>
               <w:rPr>
-                <w:rFonts w:ascii="Times New Roman" w:hAnsi="Times New Roman"/>
                 <w:b/>
                 <w:i w:val="0"/>
                 <w:color w:val="000000"/>
@@ -7086,7 +6906,6 @@
             <w:r/>
             <w:r>
               <w:rPr>
-                <w:rFonts w:ascii="Times New Roman" w:hAnsi="Times New Roman"/>
                 <w:b/>
                 <w:i w:val="0"/>
                 <w:color w:val="000000"/>
@@ -7097,7 +6916,6 @@
             </w:r>
             <w:r>
               <w:rPr>
-                <w:rFonts w:ascii="Times New Roman" w:hAnsi="Times New Roman"/>
                 <w:b w:val="0"/>
                 <w:i w:val="0"/>
                 <w:color w:val="000000"/>
@@ -7132,7 +6950,6 @@
             <w:r/>
             <w:r>
               <w:rPr>
-                <w:rFonts w:ascii="Times New Roman" w:hAnsi="Times New Roman"/>
                 <w:b w:val="0"/>
                 <w:i w:val="0"/>
                 <w:color w:val="000000"/>
@@ -7167,7 +6984,6 @@
             <w:r/>
             <w:r>
               <w:rPr>
-                <w:rFonts w:ascii="Times New Roman" w:hAnsi="Times New Roman"/>
                 <w:b w:val="0"/>
                 <w:i w:val="0"/>
                 <w:color w:val="000000"/>
@@ -7231,7 +7047,6 @@
             <w:r/>
             <w:r>
               <w:rPr>
-                <w:rFonts w:ascii="Times New Roman" w:hAnsi="Times New Roman"/>
                 <w:b/>
                 <w:i w:val="0"/>
                 <w:color w:val="000000"/>
@@ -7266,7 +7081,6 @@
             <w:r/>
             <w:r>
               <w:rPr>
-                <w:rFonts w:ascii="Times New Roman" w:hAnsi="Times New Roman"/>
                 <w:b w:val="0"/>
                 <w:i w:val="0"/>
                 <w:color w:val="000000"/>
@@ -7301,7 +7115,6 @@
             <w:r/>
             <w:r>
               <w:rPr>
-                <w:rFonts w:ascii="Times New Roman" w:hAnsi="Times New Roman"/>
                 <w:b/>
                 <w:i w:val="0"/>
                 <w:color w:val="000000"/>
@@ -7312,7 +7125,6 @@
             </w:r>
             <w:r>
               <w:rPr>
-                <w:rFonts w:ascii="Times New Roman" w:hAnsi="Times New Roman"/>
                 <w:b w:val="0"/>
                 <w:i w:val="0"/>
                 <w:color w:val="000000"/>
@@ -7349,7 +7161,6 @@
             <w:r/>
             <w:r>
               <w:rPr>
-                <w:rFonts w:ascii="Times New Roman" w:hAnsi="Times New Roman"/>
                 <w:b/>
                 <w:i w:val="0"/>
                 <w:color w:val="000000"/>
@@ -7384,7 +7195,6 @@
             <w:r/>
             <w:r>
               <w:rPr>
-                <w:rFonts w:ascii="Times New Roman" w:hAnsi="Times New Roman"/>
                 <w:b w:val="0"/>
                 <w:i w:val="0"/>
                 <w:color w:val="000000"/>
@@ -7419,7 +7229,6 @@
             <w:r/>
             <w:r>
               <w:rPr>
-                <w:rFonts w:ascii="Times New Roman" w:hAnsi="Times New Roman"/>
                 <w:b w:val="0"/>
                 <w:i w:val="0"/>
                 <w:color w:val="000000"/>
@@ -7483,7 +7292,6 @@
             <w:r/>
             <w:r>
               <w:rPr>
-                <w:rFonts w:ascii="Times New Roman" w:hAnsi="Times New Roman"/>
                 <w:b w:val="0"/>
                 <w:i w:val="0"/>
                 <w:color w:val="000000"/>
@@ -7518,7 +7326,6 @@
             <w:r/>
             <w:r>
               <w:rPr>
-                <w:rFonts w:ascii="Times New Roman" w:hAnsi="Times New Roman"/>
                 <w:b w:val="0"/>
                 <w:i w:val="0"/>
                 <w:color w:val="000000"/>
@@ -7553,7 +7360,6 @@
             <w:r/>
             <w:r>
               <w:rPr>
-                <w:rFonts w:ascii="Times New Roman" w:hAnsi="Times New Roman"/>
                 <w:b w:val="0"/>
                 <w:i w:val="0"/>
                 <w:color w:val="000000"/>
@@ -7590,7 +7396,6 @@
             <w:r/>
             <w:r>
               <w:rPr>
-                <w:rFonts w:ascii="Times New Roman" w:hAnsi="Times New Roman"/>
                 <w:b/>
                 <w:i w:val="0"/>
                 <w:color w:val="000000"/>
@@ -7625,7 +7430,6 @@
             <w:r/>
             <w:r>
               <w:rPr>
-                <w:rFonts w:ascii="Times New Roman" w:hAnsi="Times New Roman"/>
                 <w:b w:val="0"/>
                 <w:i w:val="0"/>
                 <w:color w:val="000000"/>
@@ -7660,7 +7464,6 @@
             <w:r/>
             <w:r>
               <w:rPr>
-                <w:rFonts w:ascii="Times New Roman" w:hAnsi="Times New Roman"/>
                 <w:b w:val="0"/>
                 <w:i w:val="0"/>
                 <w:color w:val="000000"/>
@@ -7724,7 +7527,6 @@
             <w:r/>
             <w:r>
               <w:rPr>
-                <w:rFonts w:ascii="Times New Roman" w:hAnsi="Times New Roman"/>
                 <w:b w:val="0"/>
                 <w:i w:val="0"/>
                 <w:color w:val="000000"/>
@@ -7759,7 +7561,6 @@
             <w:r/>
             <w:r>
               <w:rPr>
-                <w:rFonts w:ascii="Times New Roman" w:hAnsi="Times New Roman"/>
                 <w:b w:val="0"/>
                 <w:i w:val="0"/>
                 <w:color w:val="000000"/>
@@ -7794,7 +7595,6 @@
             <w:r/>
             <w:r>
               <w:rPr>
-                <w:rFonts w:ascii="Times New Roman" w:hAnsi="Times New Roman"/>
                 <w:b w:val="0"/>
                 <w:i w:val="0"/>
                 <w:color w:val="000000"/>
@@ -7831,7 +7631,6 @@
             <w:r/>
             <w:r>
               <w:rPr>
-                <w:rFonts w:ascii="Times New Roman" w:hAnsi="Times New Roman"/>
                 <w:b/>
                 <w:i w:val="0"/>
                 <w:color w:val="000000"/>
@@ -7842,7 +7641,6 @@
             </w:r>
             <w:r>
               <w:rPr>
-                <w:rFonts w:ascii="Times New Roman" w:hAnsi="Times New Roman"/>
                 <w:b w:val="0"/>
                 <w:i w:val="0"/>
                 <w:color w:val="000000"/>
@@ -7877,7 +7675,6 @@
             <w:r/>
             <w:r>
               <w:rPr>
-                <w:rFonts w:ascii="Times New Roman" w:hAnsi="Times New Roman"/>
                 <w:b w:val="0"/>
                 <w:i w:val="0"/>
                 <w:color w:val="000000"/>
@@ -7912,7 +7709,6 @@
             <w:r/>
             <w:r>
               <w:rPr>
-                <w:rFonts w:ascii="Times New Roman" w:hAnsi="Times New Roman"/>
                 <w:b w:val="0"/>
                 <w:i w:val="0"/>
                 <w:color w:val="000000"/>
@@ -7976,7 +7772,6 @@
             <w:r/>
             <w:r>
               <w:rPr>
-                <w:rFonts w:ascii="Times New Roman" w:hAnsi="Times New Roman"/>
                 <w:b w:val="0"/>
                 <w:i w:val="0"/>
                 <w:color w:val="000000"/>
@@ -8011,7 +7806,6 @@
             <w:r/>
             <w:r>
               <w:rPr>
-                <w:rFonts w:ascii="Times New Roman" w:hAnsi="Times New Roman"/>
                 <w:b w:val="0"/>
                 <w:i w:val="0"/>
                 <w:color w:val="000000"/>
@@ -8046,7 +7840,6 @@
             <w:r/>
             <w:r>
               <w:rPr>
-                <w:rFonts w:ascii="Times New Roman" w:hAnsi="Times New Roman"/>
                 <w:b w:val="0"/>
                 <w:i w:val="0"/>
                 <w:color w:val="000000"/>
@@ -8083,7 +7876,6 @@
             <w:r/>
             <w:r>
               <w:rPr>
-                <w:rFonts w:ascii="Times New Roman" w:hAnsi="Times New Roman"/>
                 <w:b/>
                 <w:i w:val="0"/>
                 <w:color w:val="000000"/>
@@ -8094,7 +7886,6 @@
             </w:r>
             <w:r>
               <w:rPr>
-                <w:rFonts w:ascii="Times New Roman" w:hAnsi="Times New Roman"/>
                 <w:b w:val="0"/>
                 <w:i w:val="0"/>
                 <w:color w:val="000000"/>
@@ -8129,7 +7920,6 @@
             <w:r/>
             <w:r>
               <w:rPr>
-                <w:rFonts w:ascii="Times New Roman" w:hAnsi="Times New Roman"/>
                 <w:b w:val="0"/>
                 <w:i w:val="0"/>
                 <w:color w:val="000000"/>
@@ -8164,7 +7954,6 @@
             <w:r/>
             <w:r>
               <w:rPr>
-                <w:rFonts w:ascii="Times New Roman" w:hAnsi="Times New Roman"/>
                 <w:b w:val="0"/>
                 <w:i w:val="0"/>
                 <w:color w:val="000000"/>
@@ -8228,7 +8017,6 @@
             <w:r/>
             <w:r>
               <w:rPr>
-                <w:rFonts w:ascii="Times New Roman" w:hAnsi="Times New Roman"/>
                 <w:b w:val="0"/>
                 <w:i w:val="0"/>
                 <w:color w:val="000000"/>
@@ -8263,7 +8051,6 @@
             <w:r/>
             <w:r>
               <w:rPr>
-                <w:rFonts w:ascii="Times New Roman" w:hAnsi="Times New Roman"/>
                 <w:b w:val="0"/>
                 <w:i w:val="0"/>
                 <w:color w:val="000000"/>
@@ -8298,7 +8085,6 @@
             <w:r/>
             <w:r>
               <w:rPr>
-                <w:rFonts w:ascii="Times New Roman" w:hAnsi="Times New Roman"/>
                 <w:b w:val="0"/>
                 <w:i w:val="0"/>
                 <w:color w:val="000000"/>
@@ -8335,7 +8121,6 @@
             <w:r/>
             <w:r>
               <w:rPr>
-                <w:rFonts w:ascii="Times New Roman" w:hAnsi="Times New Roman"/>
                 <w:b/>
                 <w:i w:val="0"/>
                 <w:color w:val="000000"/>
@@ -8346,7 +8131,6 @@
             </w:r>
             <w:r>
               <w:rPr>
-                <w:rFonts w:ascii="Times New Roman" w:hAnsi="Times New Roman"/>
                 <w:b w:val="0"/>
                 <w:i w:val="0"/>
                 <w:color w:val="000000"/>
@@ -8381,7 +8165,6 @@
             <w:r/>
             <w:r>
               <w:rPr>
-                <w:rFonts w:ascii="Times New Roman" w:hAnsi="Times New Roman"/>
                 <w:b w:val="0"/>
                 <w:i w:val="0"/>
                 <w:color w:val="000000"/>
@@ -8416,7 +8199,6 @@
             <w:r/>
             <w:r>
               <w:rPr>
-                <w:rFonts w:ascii="Times New Roman" w:hAnsi="Times New Roman"/>
                 <w:b w:val="0"/>
                 <w:i w:val="0"/>
                 <w:color w:val="000000"/>
@@ -8480,7 +8262,6 @@
             <w:r/>
             <w:r>
               <w:rPr>
-                <w:rFonts w:ascii="Times New Roman" w:hAnsi="Times New Roman"/>
                 <w:b/>
                 <w:i w:val="0"/>
                 <w:color w:val="000000"/>
@@ -8515,7 +8296,6 @@
             <w:r/>
             <w:r>
               <w:rPr>
-                <w:rFonts w:ascii="Times New Roman" w:hAnsi="Times New Roman"/>
                 <w:b w:val="0"/>
                 <w:i w:val="0"/>
                 <w:color w:val="000000"/>
@@ -8550,7 +8330,6 @@
             <w:r/>
             <w:r>
               <w:rPr>
-                <w:rFonts w:ascii="Times New Roman" w:hAnsi="Times New Roman"/>
                 <w:b/>
                 <w:i w:val="0"/>
                 <w:color w:val="000000"/>
@@ -8561,7 +8340,6 @@
             </w:r>
             <w:r>
               <w:rPr>
-                <w:rFonts w:ascii="Times New Roman" w:hAnsi="Times New Roman"/>
                 <w:b w:val="0"/>
                 <w:i w:val="0"/>
                 <w:color w:val="000000"/>
@@ -8587,7 +8365,6 @@
       </w:pPr>
       <w:r>
         <w:rPr>
-          <w:rFonts w:ascii="Times New Roman" w:hAnsi="Times New Roman"/>
           <w:b w:val="0"/>
           <w:i w:val="0"/>
           <w:color w:val="000000"/>
@@ -8603,7 +8380,6 @@
       </m:oMath>
       <w:r>
         <w:rPr>
-          <w:rFonts w:ascii="Times New Roman" w:hAnsi="Times New Roman"/>
           <w:b w:val="0"/>
           <w:i w:val="0"/>
           <w:color w:val="000000"/>
@@ -8621,7 +8397,6 @@
       </w:pPr>
       <w:r>
         <w:rPr>
-          <w:rFonts w:ascii="Times New Roman" w:hAnsi="Times New Roman"/>
           <w:b w:val="0"/>
           <w:i w:val="0"/>
           <w:color w:val="000000"/>
@@ -8639,7 +8414,6 @@
       </w:pPr>
       <w:r>
         <w:rPr>
-          <w:rFonts w:ascii="Times New Roman" w:hAnsi="Times New Roman"/>
           <w:b/>
           <w:i w:val="0"/>
           <w:color w:val="000000"/>
@@ -8650,7 +8424,6 @@
       </w:r>
       <w:r>
         <w:rPr>
-          <w:rFonts w:ascii="Times New Roman" w:hAnsi="Times New Roman"/>
           <w:b/>
           <w:i w:val="0"/>
           <w:color w:val="000000"/>
@@ -8700,7 +8473,6 @@
             <w:r/>
             <w:r>
               <w:rPr>
-                <w:rFonts w:ascii="Times New Roman" w:hAnsi="Times New Roman"/>
                 <w:b/>
                 <w:i w:val="0"/>
                 <w:color w:val="000000"/>
@@ -8740,7 +8512,6 @@
             <w:r/>
             <w:r>
               <w:rPr>
-                <w:rFonts w:ascii="Times New Roman" w:hAnsi="Times New Roman"/>
                 <w:b/>
                 <w:i w:val="0"/>
                 <w:color w:val="000000"/>
@@ -8775,7 +8546,6 @@
             <w:r/>
             <w:r>
               <w:rPr>
-                <w:rFonts w:ascii="Times New Roman" w:hAnsi="Times New Roman"/>
                 <w:b/>
                 <w:i w:val="0"/>
                 <w:color w:val="000000"/>
@@ -8810,7 +8580,6 @@
             <w:r/>
             <w:r>
               <w:rPr>
-                <w:rFonts w:ascii="Times New Roman" w:hAnsi="Times New Roman"/>
                 <w:b/>
                 <w:i w:val="0"/>
                 <w:color w:val="000000"/>
@@ -8845,7 +8614,6 @@
             <w:r/>
             <w:r>
               <w:rPr>
-                <w:rFonts w:ascii="Times New Roman" w:hAnsi="Times New Roman"/>
                 <w:b/>
                 <w:i w:val="0"/>
                 <w:color w:val="000000"/>
@@ -8880,7 +8648,6 @@
             <w:r/>
             <w:r>
               <w:rPr>
-                <w:rFonts w:ascii="Times New Roman" w:hAnsi="Times New Roman"/>
                 <w:b/>
                 <w:i w:val="0"/>
                 <w:color w:val="000000"/>
@@ -8917,7 +8684,6 @@
             <w:r/>
             <w:r>
               <w:rPr>
-                <w:rFonts w:ascii="Times New Roman" w:hAnsi="Times New Roman"/>
                 <w:b/>
                 <w:i w:val="0"/>
                 <w:color w:val="000000"/>
@@ -8938,7 +8704,6 @@
             </m:oMath>
             <w:r>
               <w:rPr>
-                <w:rFonts w:ascii="Times New Roman" w:hAnsi="Times New Roman"/>
                 <w:b/>
                 <w:i w:val="0"/>
                 <w:color w:val="000000"/>
@@ -8973,7 +8738,6 @@
             <w:r/>
             <w:r>
               <w:rPr>
-                <w:rFonts w:ascii="Times New Roman" w:hAnsi="Times New Roman"/>
                 <w:b w:val="0"/>
                 <w:i w:val="0"/>
                 <w:color w:val="000000"/>
@@ -9008,7 +8772,6 @@
             <w:r/>
             <w:r>
               <w:rPr>
-                <w:rFonts w:ascii="Times New Roman" w:hAnsi="Times New Roman"/>
                 <w:b w:val="0"/>
                 <w:i w:val="0"/>
                 <w:color w:val="000000"/>
@@ -9043,7 +8806,6 @@
             <w:r/>
             <w:r>
               <w:rPr>
-                <w:rFonts w:ascii="Times New Roman" w:hAnsi="Times New Roman"/>
                 <w:b/>
                 <w:i w:val="0"/>
                 <w:color w:val="000000"/>
@@ -9078,7 +8840,6 @@
             <w:r/>
             <w:r>
               <w:rPr>
-                <w:rFonts w:ascii="Times New Roman" w:hAnsi="Times New Roman"/>
                 <w:b w:val="0"/>
                 <w:i w:val="0"/>
                 <w:color w:val="000000"/>
@@ -9113,7 +8874,6 @@
             <w:r/>
             <w:r>
               <w:rPr>
-                <w:rFonts w:ascii="Times New Roman" w:hAnsi="Times New Roman"/>
                 <w:b w:val="0"/>
                 <w:i w:val="0"/>
                 <w:color w:val="000000"/>
@@ -9150,7 +8910,6 @@
             <w:r/>
             <w:r>
               <w:rPr>
-                <w:rFonts w:ascii="Times New Roman" w:hAnsi="Times New Roman"/>
                 <w:b/>
                 <w:i w:val="0"/>
                 <w:color w:val="000000"/>
@@ -9171,7 +8930,6 @@
             </m:oMath>
             <w:r>
               <w:rPr>
-                <w:rFonts w:ascii="Times New Roman" w:hAnsi="Times New Roman"/>
                 <w:b/>
                 <w:i w:val="0"/>
                 <w:color w:val="000000"/>
@@ -9206,7 +8964,6 @@
             <w:r/>
             <w:r>
               <w:rPr>
-                <w:rFonts w:ascii="Times New Roman" w:hAnsi="Times New Roman"/>
                 <w:b w:val="0"/>
                 <w:i w:val="0"/>
                 <w:color w:val="000000"/>
@@ -9241,7 +8998,6 @@
             <w:r/>
             <w:r>
               <w:rPr>
-                <w:rFonts w:ascii="Times New Roman" w:hAnsi="Times New Roman"/>
                 <w:b w:val="0"/>
                 <w:i w:val="0"/>
                 <w:color w:val="000000"/>
@@ -9276,7 +9032,6 @@
             <w:r/>
             <w:r>
               <w:rPr>
-                <w:rFonts w:ascii="Times New Roman" w:hAnsi="Times New Roman"/>
                 <w:b/>
                 <w:i w:val="0"/>
                 <w:color w:val="000000"/>
@@ -9311,7 +9066,6 @@
             <w:r/>
             <w:r>
               <w:rPr>
-                <w:rFonts w:ascii="Times New Roman" w:hAnsi="Times New Roman"/>
                 <w:b w:val="0"/>
                 <w:i w:val="0"/>
                 <w:color w:val="000000"/>
@@ -9346,7 +9100,6 @@
             <w:r/>
             <w:r>
               <w:rPr>
-                <w:rFonts w:ascii="Times New Roman" w:hAnsi="Times New Roman"/>
                 <w:b w:val="0"/>
                 <w:i w:val="0"/>
                 <w:color w:val="000000"/>
@@ -9383,7 +9136,6 @@
             <w:r/>
             <w:r>
               <w:rPr>
-                <w:rFonts w:ascii="Times New Roman" w:hAnsi="Times New Roman"/>
                 <w:b/>
                 <w:i w:val="0"/>
                 <w:color w:val="000000"/>
@@ -9404,7 +9156,6 @@
             </m:oMath>
             <w:r>
               <w:rPr>
-                <w:rFonts w:ascii="Times New Roman" w:hAnsi="Times New Roman"/>
                 <w:b/>
                 <w:i w:val="0"/>
                 <w:color w:val="000000"/>
@@ -9439,7 +9190,6 @@
             <w:r/>
             <w:r>
               <w:rPr>
-                <w:rFonts w:ascii="Times New Roman" w:hAnsi="Times New Roman"/>
                 <w:b w:val="0"/>
                 <w:i w:val="0"/>
                 <w:color w:val="000000"/>
@@ -9474,7 +9224,6 @@
             <w:r/>
             <w:r>
               <w:rPr>
-                <w:rFonts w:ascii="Times New Roman" w:hAnsi="Times New Roman"/>
                 <w:b w:val="0"/>
                 <w:i w:val="0"/>
                 <w:color w:val="000000"/>
@@ -9509,7 +9258,6 @@
             <w:r/>
             <w:r>
               <w:rPr>
-                <w:rFonts w:ascii="Times New Roman" w:hAnsi="Times New Roman"/>
                 <w:b/>
                 <w:i w:val="0"/>
                 <w:color w:val="000000"/>
@@ -9544,7 +9292,6 @@
             <w:r/>
             <w:r>
               <w:rPr>
-                <w:rFonts w:ascii="Times New Roman" w:hAnsi="Times New Roman"/>
                 <w:b w:val="0"/>
                 <w:i w:val="0"/>
                 <w:color w:val="000000"/>
@@ -9579,7 +9326,6 @@
             <w:r/>
             <w:r>
               <w:rPr>
-                <w:rFonts w:ascii="Times New Roman" w:hAnsi="Times New Roman"/>
                 <w:b w:val="0"/>
                 <w:i w:val="0"/>
                 <w:color w:val="000000"/>
@@ -9616,7 +9362,6 @@
             <w:r/>
             <w:r>
               <w:rPr>
-                <w:rFonts w:ascii="Times New Roman" w:hAnsi="Times New Roman"/>
                 <w:b/>
                 <w:i w:val="0"/>
                 <w:color w:val="000000"/>
@@ -9637,7 +9382,6 @@
             </m:oMath>
             <w:r>
               <w:rPr>
-                <w:rFonts w:ascii="Times New Roman" w:hAnsi="Times New Roman"/>
                 <w:b/>
                 <w:i w:val="0"/>
                 <w:color w:val="000000"/>
@@ -9672,7 +9416,6 @@
             <w:r/>
             <w:r>
               <w:rPr>
-                <w:rFonts w:ascii="Times New Roman" w:hAnsi="Times New Roman"/>
                 <w:b w:val="0"/>
                 <w:i w:val="0"/>
                 <w:color w:val="000000"/>
@@ -9707,7 +9450,6 @@
             <w:r/>
             <w:r>
               <w:rPr>
-                <w:rFonts w:ascii="Times New Roman" w:hAnsi="Times New Roman"/>
                 <w:b w:val="0"/>
                 <w:i w:val="0"/>
                 <w:color w:val="000000"/>
@@ -9742,7 +9484,6 @@
             <w:r/>
             <w:r>
               <w:rPr>
-                <w:rFonts w:ascii="Times New Roman" w:hAnsi="Times New Roman"/>
                 <w:b/>
                 <w:i w:val="0"/>
                 <w:color w:val="000000"/>
@@ -9777,7 +9518,6 @@
             <w:r/>
             <w:r>
               <w:rPr>
-                <w:rFonts w:ascii="Times New Roman" w:hAnsi="Times New Roman"/>
                 <w:b w:val="0"/>
                 <w:i w:val="0"/>
                 <w:color w:val="000000"/>
@@ -9812,7 +9552,6 @@
             <w:r/>
             <w:r>
               <w:rPr>
-                <w:rFonts w:ascii="Times New Roman" w:hAnsi="Times New Roman"/>
                 <w:b w:val="0"/>
                 <w:i w:val="0"/>
                 <w:color w:val="000000"/>
@@ -9838,7 +9577,6 @@
       </w:pPr>
       <w:r>
         <w:rPr>
-          <w:rFonts w:ascii="Times New Roman" w:hAnsi="Times New Roman"/>
           <w:b w:val="0"/>
           <w:i w:val="0"/>
           <w:color w:val="000000"/>
@@ -9856,7 +9594,6 @@
       </w:pPr>
       <w:r>
         <w:rPr>
-          <w:rFonts w:ascii="Times New Roman" w:hAnsi="Times New Roman"/>
           <w:b w:val="0"/>
           <w:i w:val="0"/>
           <w:color w:val="000000"/>
@@ -9914,7 +9651,6 @@
       </w:pPr>
       <w:r>
         <w:rPr>
-          <w:rFonts w:ascii="Times New Roman" w:hAnsi="Times New Roman"/>
           <w:b/>
           <w:i w:val="0"/>
           <w:color w:val="000000"/>
@@ -9925,7 +9661,6 @@
       </w:r>
       <w:r>
         <w:rPr>
-          <w:rFonts w:ascii="Times New Roman" w:hAnsi="Times New Roman"/>
           <w:b/>
           <w:i w:val="0"/>
           <w:color w:val="000000"/>
@@ -9943,7 +9678,6 @@
       </w:pPr>
       <w:r>
         <w:rPr>
-          <w:rFonts w:ascii="SimHei" w:hAnsi="SimHei"/>
           <w:b/>
           <w:i w:val="0"/>
           <w:color w:val="000000"/>
@@ -9961,7 +9695,6 @@
       </w:pPr>
       <w:r>
         <w:rPr>
-          <w:rFonts w:ascii="Times New Roman" w:hAnsi="Times New Roman"/>
           <w:b w:val="0"/>
           <w:i w:val="0"/>
           <w:color w:val="000000"/>
@@ -9979,7 +9712,6 @@
       </w:pPr>
       <w:r>
         <w:rPr>
-          <w:rFonts w:ascii="Times New Roman" w:hAnsi="Times New Roman"/>
           <w:b/>
           <w:i w:val="0"/>
           <w:color w:val="000000"/>
@@ -9990,7 +9722,6 @@
       </w:r>
       <w:r>
         <w:rPr>
-          <w:rFonts w:ascii="Times New Roman" w:hAnsi="Times New Roman"/>
           <w:b/>
           <w:i w:val="0"/>
           <w:color w:val="000000"/>
@@ -10041,7 +9772,6 @@
             <w:r/>
             <w:r>
               <w:rPr>
-                <w:rFonts w:ascii="Times New Roman" w:hAnsi="Times New Roman"/>
                 <w:b/>
                 <w:i w:val="0"/>
                 <w:color w:val="000000"/>
@@ -10076,7 +9806,6 @@
             <w:r/>
             <w:r>
               <w:rPr>
-                <w:rFonts w:ascii="Times New Roman" w:hAnsi="Times New Roman"/>
                 <w:b/>
                 <w:i w:val="0"/>
                 <w:color w:val="000000"/>
@@ -10111,7 +9840,6 @@
             <w:r/>
             <w:r>
               <w:rPr>
-                <w:rFonts w:ascii="Times New Roman" w:hAnsi="Times New Roman"/>
                 <w:b/>
                 <w:i w:val="0"/>
                 <w:color w:val="000000"/>
@@ -10146,7 +9874,6 @@
             <w:r/>
             <w:r>
               <w:rPr>
-                <w:rFonts w:ascii="Times New Roman" w:hAnsi="Times New Roman"/>
                 <w:b/>
                 <w:i w:val="0"/>
                 <w:color w:val="000000"/>
@@ -10181,7 +9908,6 @@
             <w:r/>
             <w:r>
               <w:rPr>
-                <w:rFonts w:ascii="Times New Roman" w:hAnsi="Times New Roman"/>
                 <w:b/>
                 <w:i w:val="0"/>
                 <w:color w:val="000000"/>
@@ -10216,7 +9942,6 @@
             <w:r/>
             <w:r>
               <w:rPr>
-                <w:rFonts w:ascii="Times New Roman" w:hAnsi="Times New Roman"/>
                 <w:b/>
                 <w:i w:val="0"/>
                 <w:color w:val="000000"/>
@@ -10251,7 +9976,6 @@
             <w:r/>
             <w:r>
               <w:rPr>
-                <w:rFonts w:ascii="Times New Roman" w:hAnsi="Times New Roman"/>
                 <w:b/>
                 <w:i w:val="0"/>
                 <w:color w:val="000000"/>
@@ -10288,7 +10012,6 @@
             <w:r/>
             <w:r>
               <w:rPr>
-                <w:rFonts w:ascii="Times New Roman" w:hAnsi="Times New Roman"/>
                 <w:b/>
                 <w:i w:val="0"/>
                 <w:color w:val="000000"/>
@@ -10323,7 +10046,6 @@
             <w:r/>
             <w:r>
               <w:rPr>
-                <w:rFonts w:ascii="Times New Roman" w:hAnsi="Times New Roman"/>
                 <w:b w:val="0"/>
                 <w:i w:val="0"/>
                 <w:color w:val="000000"/>
@@ -10358,7 +10080,6 @@
             <w:r/>
             <w:r>
               <w:rPr>
-                <w:rFonts w:ascii="Times New Roman" w:hAnsi="Times New Roman"/>
                 <w:b w:val="0"/>
                 <w:i w:val="0"/>
                 <w:color w:val="000000"/>
@@ -10393,7 +10114,6 @@
             <w:r/>
             <w:r>
               <w:rPr>
-                <w:rFonts w:ascii="Times New Roman" w:hAnsi="Times New Roman"/>
                 <w:b w:val="0"/>
                 <w:i w:val="0"/>
                 <w:color w:val="000000"/>
@@ -10428,7 +10148,6 @@
             <w:r/>
             <w:r>
               <w:rPr>
-                <w:rFonts w:ascii="Times New Roman" w:hAnsi="Times New Roman"/>
                 <w:b w:val="0"/>
                 <w:i w:val="0"/>
                 <w:color w:val="000000"/>
@@ -10463,7 +10182,6 @@
             <w:r/>
             <w:r>
               <w:rPr>
-                <w:rFonts w:ascii="Times New Roman" w:hAnsi="Times New Roman"/>
                 <w:b/>
                 <w:i w:val="0"/>
                 <w:color w:val="000000"/>
@@ -10498,7 +10216,6 @@
             <w:r/>
             <w:r>
               <w:rPr>
-                <w:rFonts w:ascii="Times New Roman" w:hAnsi="Times New Roman"/>
                 <w:b w:val="0"/>
                 <w:i w:val="0"/>
                 <w:color w:val="000000"/>
@@ -10559,7 +10276,6 @@
             <w:r/>
             <w:r>
               <w:rPr>
-                <w:rFonts w:ascii="Times New Roman" w:hAnsi="Times New Roman"/>
                 <w:b w:val="0"/>
                 <w:i w:val="0"/>
                 <w:color w:val="000000"/>
@@ -10594,7 +10310,6 @@
             <w:r/>
             <w:r>
               <w:rPr>
-                <w:rFonts w:ascii="Times New Roman" w:hAnsi="Times New Roman"/>
                 <w:b w:val="0"/>
                 <w:i w:val="0"/>
                 <w:color w:val="000000"/>
@@ -10629,7 +10344,6 @@
             <w:r/>
             <w:r>
               <w:rPr>
-                <w:rFonts w:ascii="Times New Roman" w:hAnsi="Times New Roman"/>
                 <w:b w:val="0"/>
                 <w:i w:val="0"/>
                 <w:color w:val="000000"/>
@@ -10664,7 +10378,6 @@
             <w:r/>
             <w:r>
               <w:rPr>
-                <w:rFonts w:ascii="Times New Roman" w:hAnsi="Times New Roman"/>
                 <w:b w:val="0"/>
                 <w:i w:val="0"/>
                 <w:color w:val="000000"/>
@@ -10699,7 +10412,6 @@
             <w:r/>
             <w:r>
               <w:rPr>
-                <w:rFonts w:ascii="Times New Roman" w:hAnsi="Times New Roman"/>
                 <w:b w:val="0"/>
                 <w:i w:val="0"/>
                 <w:color w:val="000000"/>
@@ -10734,7 +10446,6 @@
             <w:r/>
             <w:r>
               <w:rPr>
-                <w:rFonts w:ascii="Times New Roman" w:hAnsi="Times New Roman"/>
                 <w:b/>
                 <w:i w:val="0"/>
                 <w:color w:val="000000"/>
@@ -10745,7 +10456,6 @@
             </w:r>
             <w:r>
               <w:rPr>
-                <w:rFonts w:ascii="Times New Roman" w:hAnsi="Times New Roman"/>
                 <w:b w:val="0"/>
                 <w:i w:val="0"/>
                 <w:color w:val="000000"/>
@@ -10782,7 +10492,6 @@
             <w:r/>
             <w:r>
               <w:rPr>
-                <w:rFonts w:ascii="Times New Roman" w:hAnsi="Times New Roman"/>
                 <w:b/>
                 <w:i w:val="0"/>
                 <w:color w:val="000000"/>
@@ -10817,7 +10526,6 @@
             <w:r/>
             <w:r>
               <w:rPr>
-                <w:rFonts w:ascii="Times New Roman" w:hAnsi="Times New Roman"/>
                 <w:b w:val="0"/>
                 <w:i w:val="0"/>
                 <w:color w:val="000000"/>
@@ -10852,7 +10560,6 @@
             <w:r/>
             <w:r>
               <w:rPr>
-                <w:rFonts w:ascii="Times New Roman" w:hAnsi="Times New Roman"/>
                 <w:b w:val="0"/>
                 <w:i w:val="0"/>
                 <w:color w:val="000000"/>
@@ -10887,7 +10594,6 @@
             <w:r/>
             <w:r>
               <w:rPr>
-                <w:rFonts w:ascii="Times New Roman" w:hAnsi="Times New Roman"/>
                 <w:b w:val="0"/>
                 <w:i w:val="0"/>
                 <w:color w:val="000000"/>
@@ -10922,7 +10628,6 @@
             <w:r/>
             <w:r>
               <w:rPr>
-                <w:rFonts w:ascii="Times New Roman" w:hAnsi="Times New Roman"/>
                 <w:b w:val="0"/>
                 <w:i w:val="0"/>
                 <w:color w:val="000000"/>
@@ -10957,7 +10662,6 @@
             <w:r/>
             <w:r>
               <w:rPr>
-                <w:rFonts w:ascii="Times New Roman" w:hAnsi="Times New Roman"/>
                 <w:b/>
                 <w:i w:val="0"/>
                 <w:color w:val="000000"/>
@@ -10992,7 +10696,6 @@
             <w:r/>
             <w:r>
               <w:rPr>
-                <w:rFonts w:ascii="Times New Roman" w:hAnsi="Times New Roman"/>
                 <w:b w:val="0"/>
                 <w:i w:val="0"/>
                 <w:color w:val="000000"/>
@@ -11053,7 +10756,6 @@
             <w:r/>
             <w:r>
               <w:rPr>
-                <w:rFonts w:ascii="Times New Roman" w:hAnsi="Times New Roman"/>
                 <w:b w:val="0"/>
                 <w:i w:val="0"/>
                 <w:color w:val="000000"/>
@@ -11088,7 +10790,6 @@
             <w:r/>
             <w:r>
               <w:rPr>
-                <w:rFonts w:ascii="Times New Roman" w:hAnsi="Times New Roman"/>
                 <w:b w:val="0"/>
                 <w:i w:val="0"/>
                 <w:color w:val="000000"/>
@@ -11123,7 +10824,6 @@
             <w:r/>
             <w:r>
               <w:rPr>
-                <w:rFonts w:ascii="Times New Roman" w:hAnsi="Times New Roman"/>
                 <w:b w:val="0"/>
                 <w:i w:val="0"/>
                 <w:color w:val="000000"/>
@@ -11158,7 +10858,6 @@
             <w:r/>
             <w:r>
               <w:rPr>
-                <w:rFonts w:ascii="Times New Roman" w:hAnsi="Times New Roman"/>
                 <w:b w:val="0"/>
                 <w:i w:val="0"/>
                 <w:color w:val="000000"/>
@@ -11193,7 +10892,6 @@
             <w:r/>
             <w:r>
               <w:rPr>
-                <w:rFonts w:ascii="Times New Roman" w:hAnsi="Times New Roman"/>
                 <w:b w:val="0"/>
                 <w:i w:val="0"/>
                 <w:color w:val="000000"/>
@@ -11228,7 +10926,6 @@
             <w:r/>
             <w:r>
               <w:rPr>
-                <w:rFonts w:ascii="Times New Roman" w:hAnsi="Times New Roman"/>
                 <w:b/>
                 <w:i w:val="0"/>
                 <w:color w:val="000000"/>
@@ -11239,7 +10936,6 @@
             </w:r>
             <w:r>
               <w:rPr>
-                <w:rFonts w:ascii="Times New Roman" w:hAnsi="Times New Roman"/>
                 <w:b w:val="0"/>
                 <w:i w:val="0"/>
                 <w:color w:val="000000"/>
@@ -11276,7 +10972,6 @@
             <w:r/>
             <w:r>
               <w:rPr>
-                <w:rFonts w:ascii="Times New Roman" w:hAnsi="Times New Roman"/>
                 <w:b/>
                 <w:i w:val="0"/>
                 <w:color w:val="000000"/>
@@ -11311,7 +11006,6 @@
             <w:r/>
             <w:r>
               <w:rPr>
-                <w:rFonts w:ascii="Times New Roman" w:hAnsi="Times New Roman"/>
                 <w:b w:val="0"/>
                 <w:i w:val="0"/>
                 <w:color w:val="000000"/>
@@ -11346,7 +11040,6 @@
             <w:r/>
             <w:r>
               <w:rPr>
-                <w:rFonts w:ascii="Times New Roman" w:hAnsi="Times New Roman"/>
                 <w:b w:val="0"/>
                 <w:i w:val="0"/>
                 <w:color w:val="000000"/>
@@ -11381,7 +11074,6 @@
             <w:r/>
             <w:r>
               <w:rPr>
-                <w:rFonts w:ascii="Times New Roman" w:hAnsi="Times New Roman"/>
                 <w:b w:val="0"/>
                 <w:i w:val="0"/>
                 <w:color w:val="000000"/>
@@ -11416,7 +11108,6 @@
             <w:r/>
             <w:r>
               <w:rPr>
-                <w:rFonts w:ascii="Times New Roman" w:hAnsi="Times New Roman"/>
                 <w:b w:val="0"/>
                 <w:i w:val="0"/>
                 <w:color w:val="000000"/>
@@ -11451,7 +11142,6 @@
             <w:r/>
             <w:r>
               <w:rPr>
-                <w:rFonts w:ascii="Times New Roman" w:hAnsi="Times New Roman"/>
                 <w:b w:val="0"/>
                 <w:i w:val="0"/>
                 <w:color w:val="000000"/>
@@ -11486,7 +11176,6 @@
             <w:r/>
             <w:r>
               <w:rPr>
-                <w:rFonts w:ascii="Times New Roman" w:hAnsi="Times New Roman"/>
                 <w:b w:val="0"/>
                 <w:i w:val="0"/>
                 <w:color w:val="000000"/>
@@ -11547,7 +11236,6 @@
             <w:r/>
             <w:r>
               <w:rPr>
-                <w:rFonts w:ascii="Times New Roman" w:hAnsi="Times New Roman"/>
                 <w:b w:val="0"/>
                 <w:i w:val="0"/>
                 <w:color w:val="000000"/>
@@ -11582,7 +11270,6 @@
             <w:r/>
             <w:r>
               <w:rPr>
-                <w:rFonts w:ascii="Times New Roman" w:hAnsi="Times New Roman"/>
                 <w:b w:val="0"/>
                 <w:i w:val="0"/>
                 <w:color w:val="000000"/>
@@ -11617,7 +11304,6 @@
             <w:r/>
             <w:r>
               <w:rPr>
-                <w:rFonts w:ascii="Times New Roman" w:hAnsi="Times New Roman"/>
                 <w:b w:val="0"/>
                 <w:i w:val="0"/>
                 <w:color w:val="000000"/>
@@ -11652,7 +11338,6 @@
             <w:r/>
             <w:r>
               <w:rPr>
-                <w:rFonts w:ascii="Times New Roman" w:hAnsi="Times New Roman"/>
                 <w:b w:val="0"/>
                 <w:i w:val="0"/>
                 <w:color w:val="000000"/>
@@ -11687,7 +11372,6 @@
             <w:r/>
             <w:r>
               <w:rPr>
-                <w:rFonts w:ascii="Times New Roman" w:hAnsi="Times New Roman"/>
                 <w:b w:val="0"/>
                 <w:i w:val="0"/>
                 <w:color w:val="000000"/>
@@ -11722,7 +11406,6 @@
             <w:r/>
             <w:r>
               <w:rPr>
-                <w:rFonts w:ascii="Times New Roman" w:hAnsi="Times New Roman"/>
                 <w:b w:val="0"/>
                 <w:i w:val="0"/>
                 <w:color w:val="000000"/>
@@ -11748,7 +11431,6 @@
       </w:pPr>
       <w:r>
         <w:rPr>
-          <w:rFonts w:ascii="Times New Roman" w:hAnsi="Times New Roman"/>
           <w:b w:val="0"/>
           <w:i w:val="0"/>
           <w:color w:val="000000"/>
@@ -11764,7 +11446,6 @@
       </m:oMath>
       <w:r>
         <w:rPr>
-          <w:rFonts w:ascii="Times New Roman" w:hAnsi="Times New Roman"/>
           <w:b w:val="0"/>
           <w:i w:val="0"/>
           <w:color w:val="000000"/>
@@ -11780,7 +11461,6 @@
       </m:oMath>
       <w:r>
         <w:rPr>
-          <w:rFonts w:ascii="Times New Roman" w:hAnsi="Times New Roman"/>
           <w:b w:val="0"/>
           <w:i w:val="0"/>
           <w:color w:val="000000"/>
@@ -11796,7 +11476,6 @@
       </m:oMath>
       <w:r>
         <w:rPr>
-          <w:rFonts w:ascii="Times New Roman" w:hAnsi="Times New Roman"/>
           <w:b w:val="0"/>
           <w:i w:val="0"/>
           <w:color w:val="000000"/>
@@ -11814,7 +11493,6 @@
       </w:pPr>
       <w:r>
         <w:rPr>
-          <w:rFonts w:ascii="Times New Roman" w:hAnsi="Times New Roman"/>
           <w:b w:val="0"/>
           <w:i w:val="0"/>
           <w:color w:val="000000"/>
@@ -11872,7 +11550,6 @@
       </w:pPr>
       <w:r>
         <w:rPr>
-          <w:rFonts w:ascii="Times New Roman" w:hAnsi="Times New Roman"/>
           <w:b/>
           <w:i w:val="0"/>
           <w:color w:val="000000"/>
@@ -11883,7 +11560,6 @@
       </w:r>
       <w:r>
         <w:rPr>
-          <w:rFonts w:ascii="Times New Roman" w:hAnsi="Times New Roman"/>
           <w:b/>
           <w:i w:val="0"/>
           <w:color w:val="000000"/>
@@ -11901,7 +11577,6 @@
       </w:pPr>
       <w:r>
         <w:rPr>
-          <w:rFonts w:ascii="Times New Roman" w:hAnsi="Times New Roman"/>
           <w:b/>
           <w:i w:val="0"/>
           <w:color w:val="000000"/>
@@ -11912,7 +11587,6 @@
       </w:r>
       <w:r>
         <w:rPr>
-          <w:rFonts w:ascii="Times New Roman" w:hAnsi="Times New Roman"/>
           <w:b/>
           <w:i w:val="0"/>
           <w:color w:val="000000"/>
@@ -11965,7 +11639,6 @@
             <w:r/>
             <w:r>
               <w:rPr>
-                <w:rFonts w:ascii="Times New Roman" w:hAnsi="Times New Roman"/>
                 <w:b/>
                 <w:i w:val="0"/>
                 <w:color w:val="000000"/>
@@ -12000,7 +11673,6 @@
             <w:r/>
             <w:r>
               <w:rPr>
-                <w:rFonts w:ascii="Times New Roman" w:hAnsi="Times New Roman"/>
                 <w:b/>
                 <w:i w:val="0"/>
                 <w:color w:val="000000"/>
@@ -12016,7 +11688,6 @@
             </m:oMath>
             <w:r>
               <w:rPr>
-                <w:rFonts w:ascii="Times New Roman" w:hAnsi="Times New Roman"/>
                 <w:b/>
                 <w:i w:val="0"/>
                 <w:color w:val="000000"/>
@@ -12051,7 +11722,6 @@
             <w:r/>
             <w:r>
               <w:rPr>
-                <w:rFonts w:ascii="Times New Roman" w:hAnsi="Times New Roman"/>
                 <w:b/>
                 <w:i w:val="0"/>
                 <w:color w:val="000000"/>
@@ -12086,7 +11756,6 @@
             <w:r/>
             <w:r>
               <w:rPr>
-                <w:rFonts w:ascii="Times New Roman" w:hAnsi="Times New Roman"/>
                 <w:b/>
                 <w:i w:val="0"/>
                 <w:color w:val="000000"/>
@@ -12123,7 +11792,6 @@
             <w:r/>
             <w:r>
               <w:rPr>
-                <w:rFonts w:ascii="Times New Roman" w:hAnsi="Times New Roman"/>
                 <w:b/>
                 <w:i w:val="0"/>
                 <w:color w:val="000000"/>
@@ -12158,7 +11826,6 @@
             <w:r/>
             <w:r>
               <w:rPr>
-                <w:rFonts w:ascii="Times New Roman" w:hAnsi="Times New Roman"/>
                 <w:b w:val="0"/>
                 <w:i w:val="0"/>
                 <w:color w:val="000000"/>
@@ -12193,7 +11860,6 @@
             <w:r/>
             <w:r>
               <w:rPr>
-                <w:rFonts w:ascii="Times New Roman" w:hAnsi="Times New Roman"/>
                 <w:b w:val="0"/>
                 <w:i w:val="0"/>
                 <w:color w:val="000000"/>
@@ -12228,7 +11894,6 @@
             <w:r/>
             <w:r>
               <w:rPr>
-                <w:rFonts w:ascii="Times New Roman" w:hAnsi="Times New Roman"/>
                 <w:b w:val="0"/>
                 <w:i w:val="0"/>
                 <w:color w:val="000000"/>
@@ -12265,7 +11930,6 @@
             <w:r/>
             <w:r>
               <w:rPr>
-                <w:rFonts w:ascii="Times New Roman" w:hAnsi="Times New Roman"/>
                 <w:b/>
                 <w:i w:val="0"/>
                 <w:color w:val="000000"/>
@@ -12300,7 +11964,6 @@
             <w:r/>
             <w:r>
               <w:rPr>
-                <w:rFonts w:ascii="Times New Roman" w:hAnsi="Times New Roman"/>
                 <w:b/>
                 <w:i w:val="0"/>
                 <w:color w:val="000000"/>
@@ -12335,7 +11998,6 @@
             <w:r/>
             <w:r>
               <w:rPr>
-                <w:rFonts w:ascii="Times New Roman" w:hAnsi="Times New Roman"/>
                 <w:b w:val="0"/>
                 <w:i w:val="0"/>
                 <w:color w:val="000000"/>
@@ -12370,7 +12032,6 @@
             <w:r/>
             <w:r>
               <w:rPr>
-                <w:rFonts w:ascii="Times New Roman" w:hAnsi="Times New Roman"/>
                 <w:b w:val="0"/>
                 <w:i w:val="0"/>
                 <w:color w:val="000000"/>
@@ -12407,7 +12068,6 @@
             <w:r/>
             <w:r>
               <w:rPr>
-                <w:rFonts w:ascii="Times New Roman" w:hAnsi="Times New Roman"/>
                 <w:b/>
                 <w:i w:val="0"/>
                 <w:color w:val="000000"/>
@@ -12442,7 +12102,6 @@
             <w:r/>
             <w:r>
               <w:rPr>
-                <w:rFonts w:ascii="Times New Roman" w:hAnsi="Times New Roman"/>
                 <w:b/>
                 <w:i w:val="0"/>
                 <w:color w:val="000000"/>
@@ -12477,7 +12136,6 @@
             <w:r/>
             <w:r>
               <w:rPr>
-                <w:rFonts w:ascii="Times New Roman" w:hAnsi="Times New Roman"/>
                 <w:b w:val="0"/>
                 <w:i w:val="0"/>
                 <w:color w:val="000000"/>
@@ -12512,7 +12170,6 @@
             <w:r/>
             <w:r>
               <w:rPr>
-                <w:rFonts w:ascii="Times New Roman" w:hAnsi="Times New Roman"/>
                 <w:b w:val="0"/>
                 <w:i w:val="0"/>
                 <w:color w:val="000000"/>
@@ -12549,7 +12206,6 @@
             <w:r/>
             <w:r>
               <w:rPr>
-                <w:rFonts w:ascii="Times New Roman" w:hAnsi="Times New Roman"/>
                 <w:b/>
                 <w:i w:val="0"/>
                 <w:color w:val="000000"/>
@@ -12584,7 +12240,6 @@
             <w:r/>
             <w:r>
               <w:rPr>
-                <w:rFonts w:ascii="Times New Roman" w:hAnsi="Times New Roman"/>
                 <w:b/>
                 <w:i w:val="0"/>
                 <w:color w:val="000000"/>
@@ -12619,7 +12274,6 @@
             <w:r/>
             <w:r>
               <w:rPr>
-                <w:rFonts w:ascii="Times New Roman" w:hAnsi="Times New Roman"/>
                 <w:b w:val="0"/>
                 <w:i w:val="0"/>
                 <w:color w:val="000000"/>
@@ -12654,7 +12308,6 @@
             <w:r/>
             <w:r>
               <w:rPr>
-                <w:rFonts w:ascii="Times New Roman" w:hAnsi="Times New Roman"/>
                 <w:b w:val="0"/>
                 <w:i w:val="0"/>
                 <w:color w:val="000000"/>
@@ -12691,7 +12344,6 @@
             <w:r/>
             <w:r>
               <w:rPr>
-                <w:rFonts w:ascii="Times New Roman" w:hAnsi="Times New Roman"/>
                 <w:b/>
                 <w:i w:val="0"/>
                 <w:color w:val="000000"/>
@@ -12726,7 +12378,6 @@
             <w:r/>
             <w:r>
               <w:rPr>
-                <w:rFonts w:ascii="Times New Roman" w:hAnsi="Times New Roman"/>
                 <w:b/>
                 <w:i w:val="0"/>
                 <w:color w:val="000000"/>
@@ -12761,7 +12412,6 @@
             <w:r/>
             <w:r>
               <w:rPr>
-                <w:rFonts w:ascii="Times New Roman" w:hAnsi="Times New Roman"/>
                 <w:b w:val="0"/>
                 <w:i w:val="0"/>
                 <w:color w:val="000000"/>
@@ -12796,7 +12446,6 @@
             <w:r/>
             <w:r>
               <w:rPr>
-                <w:rFonts w:ascii="Times New Roman" w:hAnsi="Times New Roman"/>
                 <w:b w:val="0"/>
                 <w:i w:val="0"/>
                 <w:color w:val="000000"/>
@@ -12833,7 +12482,6 @@
             <w:r/>
             <w:r>
               <w:rPr>
-                <w:rFonts w:ascii="Times New Roman" w:hAnsi="Times New Roman"/>
                 <w:b/>
                 <w:i w:val="0"/>
                 <w:color w:val="000000"/>
@@ -12868,7 +12516,6 @@
             <w:r/>
             <w:r>
               <w:rPr>
-                <w:rFonts w:ascii="Times New Roman" w:hAnsi="Times New Roman"/>
                 <w:b/>
                 <w:i w:val="0"/>
                 <w:color w:val="000000"/>
@@ -12903,7 +12550,6 @@
             <w:r/>
             <w:r>
               <w:rPr>
-                <w:rFonts w:ascii="Times New Roman" w:hAnsi="Times New Roman"/>
                 <w:b w:val="0"/>
                 <w:i w:val="0"/>
                 <w:color w:val="000000"/>
@@ -12938,7 +12584,6 @@
             <w:r/>
             <w:r>
               <w:rPr>
-                <w:rFonts w:ascii="Times New Roman" w:hAnsi="Times New Roman"/>
                 <w:b/>
                 <w:i w:val="0"/>
                 <w:color w:val="000000"/>
@@ -12964,7 +12609,6 @@
       </w:pPr>
       <w:r>
         <w:rPr>
-          <w:rFonts w:ascii="Times New Roman" w:hAnsi="Times New Roman"/>
           <w:b w:val="0"/>
           <w:i w:val="0"/>
           <w:color w:val="000000"/>
@@ -12980,7 +12624,6 @@
       </m:oMath>
       <w:r>
         <w:rPr>
-          <w:rFonts w:ascii="Times New Roman" w:hAnsi="Times New Roman"/>
           <w:b w:val="0"/>
           <w:i w:val="0"/>
           <w:color w:val="000000"/>
@@ -12998,7 +12641,6 @@
       </w:pPr>
       <w:r>
         <w:rPr>
-          <w:rFonts w:ascii="Times New Roman" w:hAnsi="Times New Roman"/>
           <w:b w:val="0"/>
           <w:i w:val="0"/>
           <w:color w:val="000000"/>
@@ -13056,7 +12698,6 @@
       </w:pPr>
       <w:r>
         <w:rPr>
-          <w:rFonts w:ascii="Times New Roman" w:hAnsi="Times New Roman"/>
           <w:b/>
           <w:i w:val="0"/>
           <w:color w:val="000000"/>
@@ -13067,7 +12708,6 @@
       </w:r>
       <w:r>
         <w:rPr>
-          <w:rFonts w:ascii="Times New Roman" w:hAnsi="Times New Roman"/>
           <w:b/>
           <w:i w:val="0"/>
           <w:color w:val="000000"/>
@@ -13085,7 +12725,6 @@
       </w:pPr>
       <w:r>
         <w:rPr>
-          <w:rFonts w:ascii="Times New Roman" w:hAnsi="Times New Roman"/>
           <w:b w:val="0"/>
           <w:i w:val="0"/>
           <w:color w:val="000000"/>
@@ -13101,7 +12740,6 @@
       </m:oMath>
       <w:r>
         <w:rPr>
-          <w:rFonts w:ascii="Times New Roman" w:hAnsi="Times New Roman"/>
           <w:b w:val="0"/>
           <w:i w:val="0"/>
           <w:color w:val="000000"/>
@@ -13117,7 +12755,6 @@
       </m:oMath>
       <w:r>
         <w:rPr>
-          <w:rFonts w:ascii="Times New Roman" w:hAnsi="Times New Roman"/>
           <w:b w:val="0"/>
           <w:i w:val="0"/>
           <w:color w:val="000000"/>
@@ -13133,7 +12770,6 @@
       </m:oMath>
       <w:r>
         <w:rPr>
-          <w:rFonts w:ascii="Times New Roman" w:hAnsi="Times New Roman"/>
           <w:b w:val="0"/>
           <w:i w:val="0"/>
           <w:color w:val="000000"/>
@@ -13151,7 +12787,6 @@
       </w:pPr>
       <w:r>
         <w:rPr>
-          <w:rFonts w:ascii="Times New Roman" w:hAnsi="Times New Roman"/>
           <w:b w:val="0"/>
           <w:i w:val="0"/>
           <w:color w:val="000000"/>
@@ -13209,7 +12844,6 @@
       </w:pPr>
       <w:r>
         <w:rPr>
-          <w:rFonts w:ascii="Times New Roman" w:hAnsi="Times New Roman"/>
           <w:b/>
           <w:i w:val="0"/>
           <w:color w:val="000000"/>
@@ -13220,7 +12854,6 @@
       </w:r>
       <w:r>
         <w:rPr>
-          <w:rFonts w:ascii="Times New Roman" w:hAnsi="Times New Roman"/>
           <w:b/>
           <w:i w:val="0"/>
           <w:color w:val="000000"/>
@@ -13238,7 +12871,6 @@
       </w:pPr>
       <w:r>
         <w:rPr>
-          <w:rFonts w:ascii="Times New Roman" w:hAnsi="Times New Roman"/>
           <w:b w:val="0"/>
           <w:i w:val="0"/>
           <w:color w:val="000000"/>
@@ -13256,7 +12888,6 @@
       </w:pPr>
       <w:r>
         <w:rPr>
-          <w:rFonts w:ascii="Times New Roman" w:hAnsi="Times New Roman"/>
           <w:b w:val="0"/>
           <w:i w:val="0"/>
           <w:color w:val="000000"/>
@@ -13274,7 +12905,6 @@
       </w:pPr>
       <w:r>
         <w:rPr>
-          <w:rFonts w:ascii="Times New Roman" w:hAnsi="Times New Roman"/>
           <w:b w:val="0"/>
           <w:i w:val="0"/>
           <w:color w:val="000000"/>
@@ -13292,7 +12922,6 @@
       </w:pPr>
       <w:r>
         <w:rPr>
-          <w:rFonts w:ascii="Times New Roman" w:hAnsi="Times New Roman"/>
           <w:b w:val="0"/>
           <w:i w:val="0"/>
           <w:color w:val="000000"/>
@@ -13310,7 +12939,6 @@
       </w:pPr>
       <w:r>
         <w:rPr>
-          <w:rFonts w:ascii="SimHei" w:hAnsi="SimHei"/>
           <w:b/>
           <w:i w:val="0"/>
           <w:color w:val="000000"/>
@@ -13328,7 +12956,6 @@
       </w:pPr>
       <w:r>
         <w:rPr>
-          <w:rFonts w:ascii="Times New Roman" w:hAnsi="Times New Roman"/>
           <w:b w:val="0"/>
           <w:i w:val="0"/>
           <w:color w:val="000000"/>
@@ -13346,7 +12973,6 @@
       </w:pPr>
       <w:r>
         <w:rPr>
-          <w:rFonts w:ascii="Times New Roman" w:hAnsi="Times New Roman"/>
           <w:b w:val="0"/>
           <w:i w:val="0"/>
           <w:color w:val="000000"/>
@@ -13364,7 +12990,6 @@
       </w:pPr>
       <w:r>
         <w:rPr>
-          <w:rFonts w:ascii="Times New Roman" w:hAnsi="Times New Roman"/>
           <w:b w:val="0"/>
           <w:i w:val="0"/>
           <w:color w:val="000000"/>
@@ -13382,7 +13007,6 @@
       </w:pPr>
       <w:r>
         <w:rPr>
-          <w:rFonts w:ascii="Times New Roman" w:hAnsi="Times New Roman"/>
           <w:b w:val="0"/>
           <w:i w:val="0"/>
           <w:color w:val="000000"/>
@@ -13400,7 +13024,6 @@
       </w:pPr>
       <w:r>
         <w:rPr>
-          <w:rFonts w:ascii="SimHei" w:hAnsi="SimHei"/>
           <w:b/>
           <w:i w:val="0"/>
           <w:color w:val="000000"/>
@@ -13418,7 +13041,6 @@
       </w:pPr>
       <w:r>
         <w:rPr>
-          <w:rFonts w:ascii="Times New Roman" w:hAnsi="Times New Roman"/>
           <w:b w:val="0"/>
           <w:i w:val="0"/>
           <w:color w:val="000000"/>
@@ -13436,7 +13058,6 @@
       </w:pPr>
       <w:r>
         <w:rPr>
-          <w:rFonts w:ascii="Times New Roman" w:hAnsi="Times New Roman"/>
           <w:b w:val="0"/>
           <w:i w:val="0"/>
           <w:color w:val="000000"/>
@@ -13454,7 +13075,6 @@
       </w:pPr>
       <w:r>
         <w:rPr>
-          <w:rFonts w:ascii="Times New Roman" w:hAnsi="Times New Roman"/>
           <w:b w:val="0"/>
           <w:i w:val="0"/>
           <w:color w:val="000000"/>
@@ -13472,7 +13092,6 @@
       </w:pPr>
       <w:r>
         <w:rPr>
-          <w:rFonts w:ascii="Times New Roman" w:hAnsi="Times New Roman"/>
           <w:b w:val="0"/>
           <w:i w:val="0"/>
           <w:color w:val="000000"/>
@@ -13490,7 +13109,6 @@
       </w:pPr>
       <w:r>
         <w:rPr>
-          <w:rFonts w:ascii="Times New Roman" w:hAnsi="Times New Roman"/>
           <w:b w:val="0"/>
           <w:i w:val="0"/>
           <w:color w:val="000000"/>
@@ -13508,7 +13126,6 @@
       </w:pPr>
       <w:r>
         <w:rPr>
-          <w:rFonts w:ascii="Times New Roman" w:hAnsi="Times New Roman"/>
           <w:b w:val="0"/>
           <w:i w:val="0"/>
           <w:color w:val="000000"/>
@@ -13526,7 +13143,6 @@
       </w:pPr>
       <w:r>
         <w:rPr>
-          <w:rFonts w:ascii="Times New Roman" w:hAnsi="Times New Roman"/>
           <w:b w:val="0"/>
           <w:i w:val="0"/>
           <w:color w:val="000000"/>
@@ -13544,7 +13160,6 @@
       </w:pPr>
       <w:r>
         <w:rPr>
-          <w:rFonts w:ascii="Times New Roman" w:hAnsi="Times New Roman"/>
           <w:b w:val="0"/>
           <w:i w:val="0"/>
           <w:color w:val="000000"/>
@@ -13562,7 +13177,6 @@
       </w:pPr>
       <w:r>
         <w:rPr>
-          <w:rFonts w:ascii="Times New Roman" w:hAnsi="Times New Roman"/>
           <w:b w:val="0"/>
           <w:i w:val="0"/>
           <w:color w:val="000000"/>
@@ -13580,7 +13194,6 @@
       </w:pPr>
       <w:r>
         <w:rPr>
-          <w:rFonts w:ascii="Times New Roman" w:hAnsi="Times New Roman"/>
           <w:b w:val="0"/>
           <w:i w:val="0"/>
           <w:color w:val="000000"/>
@@ -13598,7 +13211,6 @@
       </w:pPr>
       <w:r>
         <w:rPr>
-          <w:rFonts w:ascii="Times New Roman" w:hAnsi="Times New Roman"/>
           <w:b w:val="0"/>
           <w:i w:val="0"/>
           <w:color w:val="000000"/>
@@ -13616,7 +13228,6 @@
       </w:pPr>
       <w:r>
         <w:rPr>
-          <w:rFonts w:ascii="Times New Roman" w:hAnsi="Times New Roman"/>
           <w:b w:val="0"/>
           <w:i w:val="0"/>
           <w:color w:val="000000"/>
@@ -13634,7 +13245,6 @@
       </w:pPr>
       <w:r>
         <w:rPr>
-          <w:rFonts w:ascii="Times New Roman" w:hAnsi="Times New Roman"/>
           <w:b w:val="0"/>
           <w:i w:val="0"/>
           <w:color w:val="000000"/>
@@ -13652,7 +13262,6 @@
       </w:pPr>
       <w:r>
         <w:rPr>
-          <w:rFonts w:ascii="Times New Roman" w:hAnsi="Times New Roman"/>
           <w:b w:val="0"/>
           <w:i w:val="0"/>
           <w:color w:val="000000"/>
@@ -13670,7 +13279,6 @@
       </w:pPr>
       <w:r>
         <w:rPr>
-          <w:rFonts w:ascii="Times New Roman" w:hAnsi="Times New Roman"/>
           <w:b w:val="0"/>
           <w:i w:val="0"/>
           <w:color w:val="000000"/>
@@ -13688,7 +13296,6 @@
       </w:pPr>
       <w:r>
         <w:rPr>
-          <w:rFonts w:ascii="Times New Roman" w:hAnsi="Times New Roman"/>
           <w:b w:val="0"/>
           <w:i w:val="0"/>
           <w:color w:val="000000"/>
@@ -13706,7 +13313,6 @@
       </w:pPr>
       <w:r>
         <w:rPr>
-          <w:rFonts w:ascii="Times New Roman" w:hAnsi="Times New Roman"/>
           <w:b w:val="0"/>
           <w:i w:val="0"/>
           <w:color w:val="000000"/>
@@ -13724,7 +13330,6 @@
       </w:pPr>
       <w:r>
         <w:rPr>
-          <w:rFonts w:ascii="Times New Roman" w:hAnsi="Times New Roman"/>
           <w:b w:val="0"/>
           <w:i w:val="0"/>
           <w:color w:val="000000"/>
@@ -13742,7 +13347,6 @@
       </w:pPr>
       <w:r>
         <w:rPr>
-          <w:rFonts w:ascii="Times New Roman" w:hAnsi="Times New Roman"/>
           <w:b w:val="0"/>
           <w:i w:val="0"/>
           <w:color w:val="000000"/>
@@ -13760,7 +13364,6 @@
       </w:pPr>
       <w:r>
         <w:rPr>
-          <w:rFonts w:ascii="Times New Roman" w:hAnsi="Times New Roman"/>
           <w:b w:val="0"/>
           <w:i w:val="0"/>
           <w:color w:val="000000"/>
@@ -13778,7 +13381,6 @@
       </w:pPr>
       <w:r>
         <w:rPr>
-          <w:rFonts w:ascii="Times New Roman" w:hAnsi="Times New Roman"/>
           <w:b w:val="0"/>
           <w:i w:val="0"/>
           <w:color w:val="000000"/>
@@ -13796,7 +13398,6 @@
       </w:pPr>
       <w:r>
         <w:rPr>
-          <w:rFonts w:ascii="Times New Roman" w:hAnsi="Times New Roman"/>
           <w:b w:val="0"/>
           <w:i w:val="0"/>
           <w:color w:val="000000"/>
@@ -13814,7 +13415,6 @@
       </w:pPr>
       <w:r>
         <w:rPr>
-          <w:rFonts w:ascii="Times New Roman" w:hAnsi="Times New Roman"/>
           <w:b w:val="0"/>
           <w:i w:val="0"/>
           <w:color w:val="000000"/>
@@ -13832,7 +13432,6 @@
       </w:pPr>
       <w:r>
         <w:rPr>
-          <w:rFonts w:ascii="Times New Roman" w:hAnsi="Times New Roman"/>
           <w:b w:val="0"/>
           <w:i w:val="0"/>
           <w:color w:val="000000"/>
@@ -13850,7 +13449,6 @@
       </w:pPr>
       <w:r>
         <w:rPr>
-          <w:rFonts w:ascii="Times New Roman" w:hAnsi="Times New Roman"/>
           <w:b w:val="0"/>
           <w:i w:val="0"/>
           <w:color w:val="000000"/>

</xml_diff>